<commit_message>
millora de la redacció
</commit_message>
<xml_diff>
--- a/Documents/Redacció.docx
+++ b/Documents/Redacció.docx
@@ -993,7 +993,7 @@
                                     </pic:cNvPicPr>
                                   </pic:nvPicPr>
                                   <pic:blipFill>
-                                    <a:blip r:embed="rId9">
+                                    <a:blip r:embed="rId10">
                                       <a:extLst>
                                         <a:ext uri="{28A0092B-C50C-407E-A947-70E740481C1C}">
                                           <a14:useLocalDpi xmlns:a14="http://schemas.microsoft.com/office/drawing/2010/main" val="0"/>
@@ -1070,7 +1070,7 @@
                     </pic:cNvPicPr>
                   </pic:nvPicPr>
                   <pic:blipFill>
-                    <a:blip r:embed="rId10">
+                    <a:blip r:embed="rId11">
                       <a:extLst>
                         <a:ext uri="{28A0092B-C50C-407E-A947-70E740481C1C}">
                           <a14:useLocalDpi xmlns:a14="http://schemas.microsoft.com/office/drawing/2010/main" val="0"/>
@@ -8053,7 +8053,7 @@
                     </pic:cNvPicPr>
                   </pic:nvPicPr>
                   <pic:blipFill>
-                    <a:blip r:embed="rId11" cstate="print">
+                    <a:blip r:embed="rId12" cstate="print">
                       <a:extLst>
                         <a:ext uri="{28A0092B-C50C-407E-A947-70E740481C1C}">
                           <a14:useLocalDpi xmlns:a14="http://schemas.microsoft.com/office/drawing/2010/main" val="0"/>
@@ -10985,7 +10985,7 @@
                     </pic:cNvPicPr>
                   </pic:nvPicPr>
                   <pic:blipFill rotWithShape="1">
-                    <a:blip r:embed="rId12" cstate="print">
+                    <a:blip r:embed="rId13" cstate="print">
                       <a:extLst>
                         <a:ext uri="{28A0092B-C50C-407E-A947-70E740481C1C}">
                           <a14:useLocalDpi xmlns:a14="http://schemas.microsoft.com/office/drawing/2010/main" val="0"/>
@@ -13419,10 +13419,15 @@
     </w:p>
     <w:p>
       <w:r>
-        <w:t xml:space="preserve">S'han estimat dos models paral·lels per comparar el poder predictiu de dues representacions diferents dels mateixos fenòmens. </w:t>
-      </w:r>
-      <w:r>
-        <w:t xml:space="preserve">El </w:t>
+        <w:t>S'han estimat dos models paral·lels per comparar el poder predictiu de dues representacions diferents dels mateixos fenòmens.</w:t>
+      </w:r>
+    </w:p>
+    <w:p>
+      <w:r>
+        <w:t>El RF-A utilitza les variables del model logístic (MOT_DESMOTIVACIO, MOT_FORCA_MAJOR, EST_AVALUACIO_AC, IA_SUBST_num, T_AVAL, CURS_1R i NOTA_num) i hi afegeix MOT_AUTOGESTIO i IA_EINA_ESTUDI —factors que l'EFA havia identificat com a rellevants però que el criteri BIC havia exclòs del logit explicatiu— més altres variables de control (EDAT, DESPL, N_ASSIG, GENERE, DOBLE_GRAU_EST, NOTA_ALTA), sumant un total de 15 predictors</w:t>
+      </w:r>
+      <w:r>
+        <w:t xml:space="preserve">. El </w:t>
       </w:r>
       <w:r>
         <w:rPr>
@@ -13430,21 +13435,23 @@
           <w:b w:val="0"/>
           <w:bCs w:val="0"/>
         </w:rPr>
-        <w:t>RF-A</w:t>
-      </w:r>
-      <w:r>
-        <w:t xml:space="preserve"> utilitza les variables rellevants del model logístic i afegeix algunes altres variables potencialment rellevants que també poden mesurar possibles interaccions, sumant un total de 15 predictors. El </w:t>
-      </w:r>
+        <w:t>RF-B</w:t>
+      </w:r>
+      <w:r>
+        <w:t xml:space="preserve"> substitueix els factors per les variables Likert originals més significatives, resultant en 26 predictors. L'objectiu d'aquesta doble especificació és avaluar si la síntesi dimensional de l'EFA aporta millor capacitat predictiva que mantenir les variables individuals en brut.</w:t>
+      </w:r>
+    </w:p>
+    <w:p>
       <w:r>
         <w:rPr>
           <w:rStyle w:val="Fuerte"/>
-          <w:b w:val="0"/>
-          <w:bCs w:val="0"/>
-        </w:rPr>
-        <w:t>RF-B</w:t>
-      </w:r>
-      <w:r>
-        <w:t xml:space="preserve"> substitueix els factors per les variables Likert originals més significatives, resultant en 26 predictors. L'objectiu d'aquesta doble especificació és avaluar si la síntesi dimensional de l'EFA aporta millor capacitat predictiva que mantenir les variables individuals en brut.</w:t>
+        </w:rPr>
+        <w:t>Partició train/test</w:t>
+      </w:r>
+    </w:p>
+    <w:p>
+      <w:r>
+        <w:t>Les 342 observacions s'han dividit en un 80% d'entrenament (274 observacions) i un 20% de test (68 observacions), mantenint la mateixa partició que s'ha usat en el model logístic per garantir la comparabilitat entre models.</w:t>
       </w:r>
     </w:p>
     <w:p>
@@ -13452,57 +13459,44 @@
         <w:rPr>
           <w:rStyle w:val="Fuerte"/>
         </w:rPr>
-        <w:t>Partició train/test</w:t>
-      </w:r>
-    </w:p>
-    <w:p>
-      <w:r>
-        <w:t>Les 342 observacions s'han dividit en un 80% d'entrenament (274 observacions) i un 20% de test (68 observacions), mantenint la mateixa partició que s'ha usat en el model logístic per garantir la comparabilitat entre models.</w:t>
-      </w:r>
-    </w:p>
-    <w:p>
+        <w:t>Selecció d'hiperparàmetres</w:t>
+      </w:r>
+    </w:p>
+    <w:p>
+      <w:r>
+        <w:t xml:space="preserve">El Random Forest té tres hiperparàmetres principals que cal ajustar: el </w:t>
+      </w:r>
       <w:r>
         <w:rPr>
           <w:rStyle w:val="Fuerte"/>
         </w:rPr>
-        <w:t>Selecció d'hiperparàmetres</w:t>
-      </w:r>
-    </w:p>
-    <w:p>
-      <w:r>
-        <w:t xml:space="preserve">El Random Forest té tres hiperparàmetres principals que cal ajustar: el </w:t>
+        <w:t>mtry</w:t>
+      </w:r>
+      <w:r>
+        <w:t xml:space="preserve"> (nombre de variables candidates considerades en cada divisió de node), el </w:t>
       </w:r>
       <w:r>
         <w:rPr>
           <w:rStyle w:val="Fuerte"/>
         </w:rPr>
-        <w:t>mtry</w:t>
-      </w:r>
-      <w:r>
-        <w:t xml:space="preserve"> (nombre de variables candidates considerades en cada divisió de node), el </w:t>
+        <w:t>min.node.size</w:t>
+      </w:r>
+      <w:r>
+        <w:t xml:space="preserve"> (mida mínima dels nodes terminals, que controla la profunditat dels arbres) i el </w:t>
       </w:r>
       <w:r>
         <w:rPr>
           <w:rStyle w:val="Fuerte"/>
         </w:rPr>
-        <w:t>min.node.size</w:t>
-      </w:r>
-      <w:r>
-        <w:t xml:space="preserve"> (mida mínima dels nodes terminals, que controla la profunditat dels arbres) i el </w:t>
+        <w:t>num.trees</w:t>
+      </w:r>
+      <w:r>
+        <w:t xml:space="preserve"> (nombre d'arbres). Per seleccionar-los s'ha fet un grid search manual sobre el conjunt d'entrenament, avaluant cada combinació mitjançant l'</w:t>
       </w:r>
       <w:r>
         <w:rPr>
           <w:rStyle w:val="Fuerte"/>
         </w:rPr>
-        <w:t>num.trees</w:t>
-      </w:r>
-      <w:r>
-        <w:t xml:space="preserve"> (nombre d'arbres). Per seleccionar-los s'ha fet un grid search manual sobre el conjunt d'entrenament, avaluant cada combinació mitjançant l'</w:t>
-      </w:r>
-      <w:r>
-        <w:rPr>
-          <w:rStyle w:val="Fuerte"/>
-        </w:rPr>
         <w:t>AUC Out-Of-Bag (OOB)</w:t>
       </w:r>
       <w:r>
@@ -13511,11 +13505,8 @@
     </w:p>
     <w:p>
       <w:r>
-        <w:t xml:space="preserve">L'OOB és el mecanisme de validació interna del Random Forest: com que cada arbre s'entrena amb una submostra bootstrap, aproximadament un terç de les observacions queden fora d'aquell arbre. Aquestes observacions OOB s'usen per avaluar el model sense necessitat d'un </w:t>
-      </w:r>
-      <w:r>
         <w:lastRenderedPageBreak/>
-        <w:t xml:space="preserve">conjunt de validació separat. No és un </w:t>
+        <w:t xml:space="preserve">L'OOB és el mecanisme de validació interna del Random Forest: com que cada arbre s'entrena amb una submostra bootstrap, aproximadament un terç de les observacions queden fora d'aquell arbre. Aquestes observacions OOB s'usen per avaluar el model sense necessitat d'un conjunt de validació separat. No és un </w:t>
       </w:r>
       <w:r>
         <w:rPr>
@@ -13895,20 +13886,44 @@
         <w:rPr>
           <w:lang w:eastAsia="en-US"/>
         </w:rPr>
-        <w:t>Els paràmetres optimitzats via grid search han estat max_depth (profunditat màxima dels arbres), min_child_weight (pes mínim per crear un node fill), gamma (reducció mínima de pèrdua per fer una partició), lambda (regularització L2) i alpha (regularització L1). La selecció s'ha fet per AUC mitjançant 5-fold cross-validation sobre el conjunt d'entrenament, avaluant 243 combinacions.</w:t>
-      </w:r>
-    </w:p>
-    <w:p>
-      <w:pPr>
-        <w:rPr>
-          <w:lang w:eastAsia="en-US"/>
-        </w:rPr>
-      </w:pPr>
-      <w:r>
-        <w:rPr>
-          <w:lang w:eastAsia="en-US"/>
-        </w:rPr>
-        <w:t>El nombre òptim d'arbres (best_nrounds = 274) s'ha determinat amb early stopping dins del CV.</w:t>
+        <w:t xml:space="preserve">Els paràmetres optimitzats via grid search han estat max_depth (profunditat màxima dels arbres), min_child_weight (pes mínim per crear un node fill), gamma (reducció mínima de pèrdua per fer una partició), lambda (regularització L2) i alpha (regularització L1). La selecció s'ha fet per AUC mitjançant 5-fold cross-validation sobre el conjunt d'entrenament, avaluant </w:t>
+      </w:r>
+      <w:r>
+        <w:rPr>
+          <w:lang w:eastAsia="en-US"/>
+        </w:rPr>
+        <w:t>54</w:t>
+      </w:r>
+      <w:r>
+        <w:rPr>
+          <w:lang w:eastAsia="en-US"/>
+        </w:rPr>
+        <w:t xml:space="preserve"> combinacions.</w:t>
+      </w:r>
+    </w:p>
+    <w:p>
+      <w:pPr>
+        <w:rPr>
+          <w:lang w:eastAsia="en-US"/>
+        </w:rPr>
+      </w:pPr>
+      <w:r>
+        <w:rPr>
+          <w:lang w:eastAsia="en-US"/>
+        </w:rPr>
+        <w:t xml:space="preserve">El nombre òptim d'arbres (best_nrounds = </w:t>
+      </w:r>
+      <w:r>
+        <w:rPr>
+          <w:lang w:eastAsia="en-US"/>
+        </w:rPr>
+        <w:t>31</w:t>
+      </w:r>
+      <w:r>
+        <w:rPr>
+          <w:lang w:eastAsia="en-US"/>
+        </w:rPr>
+        <w:t>) s'ha determinat amb early stopping dins del CV.</w:t>
       </w:r>
     </w:p>
     <w:p>
@@ -13922,7 +13937,107 @@
           <w:lang w:eastAsia="en-US"/>
         </w:rPr>
         <w:lastRenderedPageBreak/>
-        <w:t>La combinació guanyadora ha estat max_depth = 4, min_child_weight = 10, gamma = 2,0, lambda = 1,0 i alpha = 1,0, amb un AUC CV de 0,759. El llindar de classificació s'ha estimat per la corba Precision-Recall sobre probabilitats out-of-fold, resultant en 0,593.</w:t>
+        <w:t xml:space="preserve">La combinació guanyadora ha estat </w:t>
+      </w:r>
+      <w:r>
+        <w:rPr>
+          <w:lang w:eastAsia="en-US"/>
+        </w:rPr>
+        <w:t xml:space="preserve">max_depth = </w:t>
+      </w:r>
+      <w:r>
+        <w:rPr>
+          <w:b/>
+          <w:bCs/>
+          <w:lang w:eastAsia="en-US"/>
+        </w:rPr>
+        <w:t>2</w:t>
+      </w:r>
+      <w:r>
+        <w:rPr>
+          <w:lang w:eastAsia="en-US"/>
+        </w:rPr>
+        <w:t xml:space="preserve">, min_child_weight = </w:t>
+      </w:r>
+      <w:r>
+        <w:rPr>
+          <w:b/>
+          <w:bCs/>
+          <w:lang w:eastAsia="en-US"/>
+        </w:rPr>
+        <w:t>5</w:t>
+      </w:r>
+      <w:r>
+        <w:rPr>
+          <w:lang w:eastAsia="en-US"/>
+        </w:rPr>
+        <w:t xml:space="preserve">, gamma = </w:t>
+      </w:r>
+      <w:r>
+        <w:rPr>
+          <w:b/>
+          <w:bCs/>
+          <w:lang w:eastAsia="en-US"/>
+        </w:rPr>
+        <w:t>0</w:t>
+      </w:r>
+      <w:r>
+        <w:rPr>
+          <w:lang w:eastAsia="en-US"/>
+        </w:rPr>
+        <w:t xml:space="preserve">, lambda = </w:t>
+      </w:r>
+      <w:r>
+        <w:rPr>
+          <w:b/>
+          <w:bCs/>
+          <w:lang w:eastAsia="en-US"/>
+        </w:rPr>
+        <w:t>3,0</w:t>
+      </w:r>
+      <w:r>
+        <w:rPr>
+          <w:lang w:eastAsia="en-US"/>
+        </w:rPr>
+        <w:t xml:space="preserve"> i alpha = </w:t>
+      </w:r>
+      <w:r>
+        <w:rPr>
+          <w:lang w:eastAsia="en-US"/>
+        </w:rPr>
+        <w:t>0</w:t>
+      </w:r>
+      <w:r>
+        <w:rPr>
+          <w:lang w:eastAsia="en-US"/>
+        </w:rPr>
+        <w:t>, amb un AUC CV de 0,</w:t>
+      </w:r>
+      <w:r>
+        <w:rPr>
+          <w:b/>
+          <w:bCs/>
+          <w:lang w:eastAsia="en-US"/>
+        </w:rPr>
+        <w:t>754</w:t>
+      </w:r>
+      <w:r>
+        <w:rPr>
+          <w:lang w:eastAsia="en-US"/>
+        </w:rPr>
+        <w:t>. El llindar de classificació s'ha estimat per la corba Precision-Recall sobre probabilitats out-of-fold, resultant en 0,5</w:t>
+      </w:r>
+      <w:r>
+        <w:rPr>
+          <w:lang w:eastAsia="en-US"/>
+        </w:rPr>
+        <w:t>74</w:t>
+      </w:r>
+      <w:r>
+        <w:rPr>
+          <w:lang w:eastAsia="en-US"/>
+        </w:rPr>
+        <w:t>.</w:t>
       </w:r>
     </w:p>
     <w:p>
@@ -14034,20 +14149,83 @@
         <w:rPr>
           <w:lang w:eastAsia="en-US"/>
         </w:rPr>
-        <w:t>Els hiperparàmetres del SVM amb kernel RBF són el cost C — que controla la penalització dels errors de classificació i per tant el grau de regularització — i gamma — que determina l'amplada del kernel i la influència de cada observació sobre la frontera de decisió —. S'ha fet un grid search manual amb 5-fold CV optimitzant AUC, consistent amb la resta de models del treball. La combinació guanyadora ha estat cost = 1,0 i gamma = 0,010, amb un AUC CV de 0,775. El llindar de classificació s'ha estimat per la corba Precision-Recall sobre probabilitats OOF, resultant en 0,625.</w:t>
-      </w:r>
-    </w:p>
-    <w:p>
-      <w:pPr>
-        <w:rPr>
-          <w:lang w:eastAsia="en-US"/>
-        </w:rPr>
-      </w:pPr>
-      <w:r>
-        <w:rPr>
-          <w:lang w:eastAsia="en-US"/>
-        </w:rPr>
-        <w:t xml:space="preserve">Cal mencionar una limitació metodològica: el model final utilitza 203 vectors de suport, equivalent al 74,1% del conjunt d'entrenament. Un nombre tan elevat indica que les dues classes no presenten una frontera de decisió neta en l'espai de predictors, fins i tot amb el kernel RBF. Aquest resultat no és sorprenent: al llarg de tot el treball s'ha observat que l'absentisme és un fenomen difús, sense una separació clara entre perfils, cosa que explica per què models basats </w:t>
+        <w:t xml:space="preserve">Els hiperparàmetres del SVM amb kernel RBF són el cost C — que controla la penalització dels errors de classificació i per tant el grau de regularització — i gamma — que determina l'amplada del kernel i la influència de cada observació sobre la frontera de decisió —. S'ha fet un grid search manual amb 5-fold CV optimitzant AUC, consistent amb la resta de models del treball. La combinació guanyadora ha estat cost = </w:t>
+      </w:r>
+      <w:r>
+        <w:rPr>
+          <w:lang w:eastAsia="en-US"/>
+        </w:rPr>
+        <w:t>5</w:t>
+      </w:r>
+      <w:r>
+        <w:rPr>
+          <w:lang w:eastAsia="en-US"/>
+        </w:rPr>
+        <w:t xml:space="preserve"> i gamma = 0,010, amb un AUC CV de </w:t>
+      </w:r>
+      <w:r>
+        <w:t>0,780</w:t>
+      </w:r>
+      <w:r>
+        <w:rPr>
+          <w:lang w:eastAsia="en-US"/>
+        </w:rPr>
+        <w:t xml:space="preserve">. El llindar de classificació s'ha estimat per la corba Precision-Recall sobre probabilitats OOF, resultant en </w:t>
+      </w:r>
+      <w:r>
+        <w:rPr>
+          <w:lang w:eastAsia="en-US"/>
+        </w:rPr>
+        <w:t>0</w:t>
+      </w:r>
+      <w:r>
+        <w:rPr>
+          <w:lang w:eastAsia="en-US"/>
+        </w:rPr>
+        <w:t>,624</w:t>
+      </w:r>
+      <w:r>
+        <w:rPr>
+          <w:lang w:eastAsia="en-US"/>
+        </w:rPr>
+        <w:t>.</w:t>
+      </w:r>
+    </w:p>
+    <w:p>
+      <w:pPr>
+        <w:rPr>
+          <w:lang w:eastAsia="en-US"/>
+        </w:rPr>
+      </w:pPr>
+      <w:r>
+        <w:rPr>
+          <w:lang w:eastAsia="en-US"/>
+        </w:rPr>
+        <w:t xml:space="preserve">Cal mencionar una limitació metodològica: el model final utilitza </w:t>
+      </w:r>
+      <w:r>
+        <w:rPr>
+          <w:lang w:eastAsia="en-US"/>
+        </w:rPr>
+        <w:t>183</w:t>
+      </w:r>
+      <w:r>
+        <w:rPr>
+          <w:lang w:eastAsia="en-US"/>
+        </w:rPr>
+        <w:t xml:space="preserve"> vectors de suport, equivalent al </w:t>
+      </w:r>
+      <w:r>
+        <w:rPr>
+          <w:lang w:eastAsia="en-US"/>
+        </w:rPr>
+        <w:t>66,8</w:t>
+      </w:r>
+      <w:r>
+        <w:rPr>
+          <w:lang w:eastAsia="en-US"/>
+        </w:rPr>
+        <w:t xml:space="preserve">% del conjunt d'entrenament. Un nombre tan elevat indica que les dues classes no presenten una frontera de decisió neta en l'espai de predictors, fins i tot amb el kernel RBF. Aquest resultat no és sorprenent: al llarg de tot el treball s'ha observat que l'absentisme és un fenomen difús, sense una separació clara entre perfils, cosa que explica per què models basats </w:t>
       </w:r>
       <w:r>
         <w:rPr>
@@ -14056,1041 +14234,6 @@
         <w:lastRenderedPageBreak/>
         <w:t>en arbres —capaços de capturar interaccions i no-linealitats de manera més flexible— obtenen un rendiment superior.</w:t>
       </w:r>
-    </w:p>
-    <w:p>
-      <w:pPr>
-        <w:rPr>
-          <w:lang w:eastAsia="en-US"/>
-        </w:rPr>
-      </w:pPr>
-    </w:p>
-    <w:p>
-      <w:pPr>
-        <w:rPr>
-          <w:rFonts w:eastAsia="Aptos"/>
-        </w:rPr>
-      </w:pPr>
-      <w:r>
-        <w:rPr>
-          <w:rFonts w:eastAsia="Aptos"/>
-        </w:rPr>
-        <w:br w:type="page"/>
-      </w:r>
-    </w:p>
-    <w:p>
-      <w:pPr>
-        <w:spacing w:line="300" w:lineRule="auto"/>
-        <w:rPr>
-          <w:rFonts w:eastAsia="Aptos"/>
-          <w:color w:val="auto"/>
-          <w:kern w:val="2"/>
-          <w:szCs w:val="22"/>
-          <w:lang w:eastAsia="en-US"/>
-        </w:rPr>
-      </w:pPr>
-      <w:r>
-        <w:rPr>
-          <w:rFonts w:eastAsia="Aptos"/>
-          <w:color w:val="auto"/>
-          <w:kern w:val="2"/>
-          <w:szCs w:val="22"/>
-          <w:lang w:eastAsia="en-US"/>
-        </w:rPr>
-        <w:lastRenderedPageBreak/>
-        <w:sym w:font="Symbol" w:char="F0B7"/>
-      </w:r>
-      <w:r>
-        <w:rPr>
-          <w:rFonts w:eastAsia="Aptos"/>
-          <w:color w:val="auto"/>
-          <w:kern w:val="2"/>
-          <w:szCs w:val="22"/>
-          <w:lang w:eastAsia="en-US"/>
-        </w:rPr>
-        <w:t xml:space="preserve"> Cos del treball: capítols, apartats i subapartats:</w:t>
-      </w:r>
-    </w:p>
-    <w:p>
-      <w:pPr>
-        <w:spacing w:line="300" w:lineRule="auto"/>
-        <w:rPr>
-          <w:rFonts w:eastAsia="Aptos"/>
-          <w:color w:val="auto"/>
-          <w:kern w:val="2"/>
-          <w:szCs w:val="22"/>
-          <w:lang w:eastAsia="en-US"/>
-        </w:rPr>
-      </w:pPr>
-      <w:r>
-        <w:rPr>
-          <w:rFonts w:eastAsia="Aptos"/>
-          <w:color w:val="auto"/>
-          <w:kern w:val="2"/>
-          <w:szCs w:val="22"/>
-          <w:lang w:eastAsia="en-US"/>
-        </w:rPr>
-        <w:t>L’estructura del treball ha de ser lògica i clara. Per aconseguir-ho, el cos del treball ha de dividir-se en apartats i, si cal, subapartats; si el treball ho requereix, es poden fer més subdivisions, i en aquest cas parlem de capítols, apartats i subapartats. Els títols dels capítols, si escau, cal numerar-los amb xifres romanes consecutives (I, II, III...) i s’han d’escriure amb LLETRA RODONA, NEGRETA I MAJÚSCULES. Al final de cada capítol s’ha de fer un salt de pàgina. Els títols dels apartats (1, 2, 3...) i dels subapartats (1.1, 1.2...) es numeren amb xifres aràbigues consecutives. Els títols dels apartats s’escriuen amb lletra rodona i negreta i els títols dels subapartats, amb lletra cursiva. Al final de cada subapartat i apartat no s’ha de fer un salt de pàgina, llevat que l’apartat següent sigui el de «Conclusions».</w:t>
-      </w:r>
-    </w:p>
-    <w:p>
-      <w:pPr>
-        <w:spacing w:line="300" w:lineRule="auto"/>
-        <w:rPr>
-          <w:rFonts w:eastAsia="Aptos"/>
-          <w:color w:val="auto"/>
-          <w:kern w:val="2"/>
-          <w:szCs w:val="22"/>
-          <w:lang w:eastAsia="en-US"/>
-        </w:rPr>
-      </w:pPr>
-      <w:r>
-        <w:rPr>
-          <w:rFonts w:eastAsia="Aptos"/>
-          <w:color w:val="auto"/>
-          <w:kern w:val="2"/>
-          <w:szCs w:val="22"/>
-          <w:lang w:eastAsia="en-US"/>
-        </w:rPr>
-        <w:t>3.6. Anàlisi exploratòria de dades (EDA)</w:t>
-      </w:r>
-    </w:p>
-    <w:p>
-      <w:pPr>
-        <w:spacing w:line="300" w:lineRule="auto"/>
-        <w:rPr>
-          <w:rFonts w:eastAsia="Aptos"/>
-          <w:color w:val="auto"/>
-          <w:kern w:val="2"/>
-          <w:szCs w:val="22"/>
-          <w:lang w:eastAsia="en-US"/>
-        </w:rPr>
-      </w:pPr>
-      <w:r>
-        <w:rPr>
-          <w:rFonts w:eastAsia="Aptos"/>
-          <w:color w:val="auto"/>
-          <w:kern w:val="2"/>
-          <w:szCs w:val="22"/>
-          <w:lang w:eastAsia="en-US"/>
-        </w:rPr>
-        <w:t>Objectiu de l’EDA</w:t>
-      </w:r>
-    </w:p>
-    <w:p>
-      <w:pPr>
-        <w:spacing w:line="300" w:lineRule="auto"/>
-        <w:rPr>
-          <w:rFonts w:eastAsia="Aptos"/>
-          <w:color w:val="auto"/>
-          <w:kern w:val="2"/>
-          <w:szCs w:val="22"/>
-          <w:lang w:eastAsia="en-US"/>
-        </w:rPr>
-      </w:pPr>
-      <w:r>
-        <w:rPr>
-          <w:rFonts w:eastAsia="Aptos"/>
-          <w:color w:val="auto"/>
-          <w:kern w:val="2"/>
-          <w:szCs w:val="22"/>
-          <w:lang w:eastAsia="en-US"/>
-        </w:rPr>
-        <w:t>Tipus d’associacions analitzades</w:t>
-      </w:r>
-    </w:p>
-    <w:p>
-      <w:pPr>
-        <w:spacing w:line="300" w:lineRule="auto"/>
-        <w:rPr>
-          <w:rFonts w:eastAsia="Aptos"/>
-          <w:color w:val="auto"/>
-          <w:kern w:val="2"/>
-          <w:szCs w:val="22"/>
-          <w:lang w:eastAsia="en-US"/>
-        </w:rPr>
-      </w:pPr>
-      <w:r>
-        <w:rPr>
-          <w:rFonts w:eastAsia="Aptos"/>
-          <w:color w:val="auto"/>
-          <w:kern w:val="2"/>
-          <w:szCs w:val="22"/>
-          <w:lang w:eastAsia="en-US"/>
-        </w:rPr>
-        <w:t>Tests o mesures (chi-quadrat, correlacions, etc.)</w:t>
-      </w:r>
-    </w:p>
-    <w:p>
-      <w:pPr>
-        <w:spacing w:line="300" w:lineRule="auto"/>
-        <w:rPr>
-          <w:rFonts w:eastAsia="Aptos"/>
-          <w:color w:val="auto"/>
-          <w:kern w:val="2"/>
-          <w:szCs w:val="22"/>
-          <w:lang w:eastAsia="en-US"/>
-        </w:rPr>
-      </w:pPr>
-      <w:r>
-        <w:rPr>
-          <w:rFonts w:eastAsia="Aptos"/>
-          <w:color w:val="auto"/>
-          <w:kern w:val="2"/>
-          <w:szCs w:val="22"/>
-          <w:lang w:eastAsia="en-US"/>
-        </w:rPr>
-        <w:t>3.7. Anàlisi factorial exploratòria (EFA)</w:t>
-      </w:r>
-    </w:p>
-    <w:p>
-      <w:pPr>
-        <w:spacing w:line="300" w:lineRule="auto"/>
-        <w:rPr>
-          <w:rFonts w:eastAsia="Aptos"/>
-          <w:color w:val="auto"/>
-          <w:kern w:val="2"/>
-          <w:szCs w:val="22"/>
-          <w:lang w:eastAsia="en-US"/>
-        </w:rPr>
-      </w:pPr>
-      <w:r>
-        <w:rPr>
-          <w:rFonts w:eastAsia="Aptos"/>
-          <w:color w:val="auto"/>
-          <w:kern w:val="2"/>
-          <w:szCs w:val="22"/>
-          <w:lang w:eastAsia="en-US"/>
-        </w:rPr>
-        <w:t>Justificació del model</w:t>
-      </w:r>
-    </w:p>
-    <w:p>
-      <w:pPr>
-        <w:spacing w:line="300" w:lineRule="auto"/>
-        <w:rPr>
-          <w:rFonts w:eastAsia="Aptos"/>
-          <w:color w:val="auto"/>
-          <w:kern w:val="2"/>
-          <w:szCs w:val="22"/>
-          <w:lang w:eastAsia="en-US"/>
-        </w:rPr>
-      </w:pPr>
-      <w:r>
-        <w:rPr>
-          <w:rFonts w:eastAsia="Aptos"/>
-          <w:color w:val="auto"/>
-          <w:kern w:val="2"/>
-          <w:szCs w:val="22"/>
-          <w:lang w:eastAsia="en-US"/>
-        </w:rPr>
-        <w:t>KMO i Bartlett</w:t>
-      </w:r>
-    </w:p>
-    <w:p>
-      <w:pPr>
-        <w:spacing w:line="300" w:lineRule="auto"/>
-        <w:rPr>
-          <w:rFonts w:eastAsia="Aptos"/>
-          <w:color w:val="auto"/>
-          <w:kern w:val="2"/>
-          <w:szCs w:val="22"/>
-          <w:lang w:eastAsia="en-US"/>
-        </w:rPr>
-      </w:pPr>
-      <w:r>
-        <w:rPr>
-          <w:rFonts w:eastAsia="Aptos"/>
-          <w:color w:val="auto"/>
-          <w:kern w:val="2"/>
-          <w:szCs w:val="22"/>
-          <w:lang w:eastAsia="en-US"/>
-        </w:rPr>
-        <w:t>Mètode d’extracció</w:t>
-      </w:r>
-    </w:p>
-    <w:p>
-      <w:pPr>
-        <w:spacing w:line="300" w:lineRule="auto"/>
-        <w:rPr>
-          <w:rFonts w:eastAsia="Aptos"/>
-          <w:color w:val="auto"/>
-          <w:kern w:val="2"/>
-          <w:szCs w:val="22"/>
-          <w:lang w:eastAsia="en-US"/>
-        </w:rPr>
-      </w:pPr>
-      <w:r>
-        <w:rPr>
-          <w:rFonts w:eastAsia="Aptos"/>
-          <w:color w:val="auto"/>
-          <w:kern w:val="2"/>
-          <w:szCs w:val="22"/>
-          <w:lang w:eastAsia="en-US"/>
-        </w:rPr>
-        <w:t>Rotació</w:t>
-      </w:r>
-    </w:p>
-    <w:p>
-      <w:pPr>
-        <w:spacing w:line="300" w:lineRule="auto"/>
-        <w:rPr>
-          <w:rFonts w:eastAsia="Aptos"/>
-          <w:color w:val="auto"/>
-          <w:kern w:val="2"/>
-          <w:szCs w:val="22"/>
-          <w:lang w:eastAsia="en-US"/>
-        </w:rPr>
-      </w:pPr>
-      <w:r>
-        <w:rPr>
-          <w:rFonts w:eastAsia="Aptos"/>
-          <w:color w:val="auto"/>
-          <w:kern w:val="2"/>
-          <w:szCs w:val="22"/>
-          <w:lang w:eastAsia="en-US"/>
-        </w:rPr>
-        <w:t>Criteris de selecció de factors</w:t>
-      </w:r>
-    </w:p>
-    <w:p>
-      <w:pPr>
-        <w:spacing w:line="300" w:lineRule="auto"/>
-        <w:rPr>
-          <w:rFonts w:eastAsia="Aptos"/>
-          <w:color w:val="auto"/>
-          <w:kern w:val="2"/>
-          <w:szCs w:val="22"/>
-          <w:lang w:eastAsia="en-US"/>
-        </w:rPr>
-      </w:pPr>
-      <w:r>
-        <w:rPr>
-          <w:rFonts w:eastAsia="Aptos"/>
-          <w:color w:val="auto"/>
-          <w:kern w:val="2"/>
-          <w:szCs w:val="22"/>
-          <w:lang w:eastAsia="en-US"/>
-        </w:rPr>
-        <w:t>Construcció de puntuacions factorials</w:t>
-      </w:r>
-    </w:p>
-    <w:p>
-      <w:pPr>
-        <w:spacing w:line="300" w:lineRule="auto"/>
-        <w:rPr>
-          <w:rFonts w:eastAsia="Aptos"/>
-          <w:color w:val="auto"/>
-          <w:kern w:val="2"/>
-          <w:szCs w:val="22"/>
-          <w:lang w:eastAsia="en-US"/>
-        </w:rPr>
-      </w:pPr>
-      <w:r>
-        <w:rPr>
-          <w:rFonts w:eastAsia="Aptos"/>
-          <w:color w:val="auto"/>
-          <w:kern w:val="2"/>
-          <w:szCs w:val="22"/>
-          <w:lang w:eastAsia="en-US"/>
-        </w:rPr>
-        <w:t>3.8. Model logístic (especificació metodològica)</w:t>
-      </w:r>
-    </w:p>
-    <w:p>
-      <w:pPr>
-        <w:spacing w:line="300" w:lineRule="auto"/>
-        <w:rPr>
-          <w:rFonts w:eastAsia="Aptos"/>
-          <w:color w:val="auto"/>
-          <w:kern w:val="2"/>
-          <w:szCs w:val="22"/>
-          <w:lang w:eastAsia="en-US"/>
-        </w:rPr>
-      </w:pPr>
-      <w:r>
-        <w:rPr>
-          <w:rFonts w:eastAsia="Aptos"/>
-          <w:color w:val="auto"/>
-          <w:kern w:val="2"/>
-          <w:szCs w:val="22"/>
-          <w:lang w:eastAsia="en-US"/>
-        </w:rPr>
-        <w:t>Justificació del logit</w:t>
-      </w:r>
-    </w:p>
-    <w:p>
-      <w:pPr>
-        <w:spacing w:line="300" w:lineRule="auto"/>
-        <w:rPr>
-          <w:rFonts w:eastAsia="Aptos"/>
-          <w:color w:val="auto"/>
-          <w:kern w:val="2"/>
-          <w:szCs w:val="22"/>
-          <w:lang w:eastAsia="en-US"/>
-        </w:rPr>
-      </w:pPr>
-      <w:r>
-        <w:rPr>
-          <w:rFonts w:eastAsia="Aptos"/>
-          <w:color w:val="auto"/>
-          <w:kern w:val="2"/>
-          <w:szCs w:val="22"/>
-          <w:lang w:eastAsia="en-US"/>
-        </w:rPr>
-        <w:t>Especificació del model (equació)</w:t>
-      </w:r>
-    </w:p>
-    <w:p>
-      <w:pPr>
-        <w:spacing w:line="300" w:lineRule="auto"/>
-        <w:rPr>
-          <w:rFonts w:eastAsia="Aptos"/>
-          <w:color w:val="auto"/>
-          <w:kern w:val="2"/>
-          <w:szCs w:val="22"/>
-          <w:lang w:eastAsia="en-US"/>
-        </w:rPr>
-      </w:pPr>
-      <w:r>
-        <w:rPr>
-          <w:rFonts w:eastAsia="Aptos"/>
-          <w:color w:val="auto"/>
-          <w:kern w:val="2"/>
-          <w:szCs w:val="22"/>
-          <w:lang w:eastAsia="en-US"/>
-        </w:rPr>
-        <w:t>Variables incloses</w:t>
-      </w:r>
-    </w:p>
-    <w:p>
-      <w:pPr>
-        <w:spacing w:line="300" w:lineRule="auto"/>
-        <w:rPr>
-          <w:rFonts w:eastAsia="Aptos"/>
-          <w:color w:val="auto"/>
-          <w:kern w:val="2"/>
-          <w:szCs w:val="22"/>
-          <w:lang w:eastAsia="en-US"/>
-        </w:rPr>
-      </w:pPr>
-      <w:r>
-        <w:rPr>
-          <w:rFonts w:eastAsia="Aptos"/>
-          <w:color w:val="auto"/>
-          <w:kern w:val="2"/>
-          <w:szCs w:val="22"/>
-          <w:lang w:eastAsia="en-US"/>
-        </w:rPr>
-        <w:t>Estratègia de selecció de variables</w:t>
-      </w:r>
-    </w:p>
-    <w:p>
-      <w:pPr>
-        <w:spacing w:line="300" w:lineRule="auto"/>
-        <w:rPr>
-          <w:rFonts w:eastAsia="Aptos"/>
-          <w:color w:val="auto"/>
-          <w:kern w:val="2"/>
-          <w:szCs w:val="22"/>
-          <w:lang w:eastAsia="en-US"/>
-        </w:rPr>
-      </w:pPr>
-      <w:r>
-        <w:rPr>
-          <w:rFonts w:eastAsia="Aptos"/>
-          <w:color w:val="auto"/>
-          <w:kern w:val="2"/>
-          <w:szCs w:val="22"/>
-          <w:lang w:eastAsia="en-US"/>
-        </w:rPr>
-        <w:t>Estratègia train/test (si n’hi ha)</w:t>
-      </w:r>
-    </w:p>
-    <w:p>
-      <w:pPr>
-        <w:spacing w:line="300" w:lineRule="auto"/>
-        <w:rPr>
-          <w:rFonts w:eastAsia="Aptos"/>
-          <w:color w:val="auto"/>
-          <w:kern w:val="2"/>
-          <w:szCs w:val="22"/>
-          <w:lang w:eastAsia="en-US"/>
-        </w:rPr>
-      </w:pPr>
-      <w:r>
-        <w:rPr>
-          <w:rFonts w:eastAsia="Aptos"/>
-          <w:color w:val="auto"/>
-          <w:kern w:val="2"/>
-          <w:szCs w:val="22"/>
-          <w:lang w:eastAsia="en-US"/>
-        </w:rPr>
-        <w:t>4. RESULTATS</w:t>
-      </w:r>
-    </w:p>
-    <w:p>
-      <w:pPr>
-        <w:spacing w:line="300" w:lineRule="auto"/>
-        <w:rPr>
-          <w:rFonts w:eastAsia="Aptos"/>
-          <w:color w:val="auto"/>
-          <w:kern w:val="2"/>
-          <w:szCs w:val="22"/>
-          <w:lang w:eastAsia="en-US"/>
-        </w:rPr>
-      </w:pPr>
-      <w:r>
-        <w:rPr>
-          <w:rFonts w:eastAsia="Aptos"/>
-          <w:color w:val="auto"/>
-          <w:kern w:val="2"/>
-          <w:szCs w:val="22"/>
-          <w:lang w:eastAsia="en-US"/>
-        </w:rPr>
-        <w:lastRenderedPageBreak/>
-        <w:t>4.1. Resultats descriptius</w:t>
-      </w:r>
-    </w:p>
-    <w:p>
-      <w:pPr>
-        <w:spacing w:line="300" w:lineRule="auto"/>
-        <w:rPr>
-          <w:rFonts w:eastAsia="Aptos"/>
-          <w:color w:val="auto"/>
-          <w:kern w:val="2"/>
-          <w:szCs w:val="22"/>
-          <w:lang w:eastAsia="en-US"/>
-        </w:rPr>
-      </w:pPr>
-      <w:r>
-        <w:rPr>
-          <w:rFonts w:eastAsia="Aptos"/>
-          <w:color w:val="auto"/>
-          <w:kern w:val="2"/>
-          <w:szCs w:val="22"/>
-          <w:lang w:eastAsia="en-US"/>
-        </w:rPr>
-        <w:t>Distribució de variables principals</w:t>
-      </w:r>
-    </w:p>
-    <w:p>
-      <w:pPr>
-        <w:spacing w:line="300" w:lineRule="auto"/>
-        <w:rPr>
-          <w:rFonts w:eastAsia="Aptos"/>
-          <w:color w:val="auto"/>
-          <w:kern w:val="2"/>
-          <w:szCs w:val="22"/>
-          <w:lang w:eastAsia="en-US"/>
-        </w:rPr>
-      </w:pPr>
-      <w:r>
-        <w:rPr>
-          <w:rFonts w:eastAsia="Aptos"/>
-          <w:color w:val="auto"/>
-          <w:kern w:val="2"/>
-          <w:szCs w:val="22"/>
-          <w:lang w:eastAsia="en-US"/>
-        </w:rPr>
-        <w:t>Perfil de la mostra</w:t>
-      </w:r>
-    </w:p>
-    <w:p>
-      <w:pPr>
-        <w:spacing w:line="300" w:lineRule="auto"/>
-        <w:rPr>
-          <w:rFonts w:eastAsia="Aptos"/>
-          <w:color w:val="auto"/>
-          <w:kern w:val="2"/>
-          <w:szCs w:val="22"/>
-          <w:lang w:eastAsia="en-US"/>
-        </w:rPr>
-      </w:pPr>
-      <w:r>
-        <w:rPr>
-          <w:rFonts w:eastAsia="Aptos"/>
-          <w:color w:val="auto"/>
-          <w:kern w:val="2"/>
-          <w:szCs w:val="22"/>
-          <w:lang w:eastAsia="en-US"/>
-        </w:rPr>
-        <w:t>Assistència, notes, etc.</w:t>
-      </w:r>
-    </w:p>
-    <w:p>
-      <w:pPr>
-        <w:spacing w:line="300" w:lineRule="auto"/>
-        <w:rPr>
-          <w:rFonts w:eastAsia="Aptos"/>
-          <w:color w:val="auto"/>
-          <w:kern w:val="2"/>
-          <w:szCs w:val="22"/>
-          <w:lang w:eastAsia="en-US"/>
-        </w:rPr>
-      </w:pPr>
-      <w:r>
-        <w:rPr>
-          <w:rFonts w:eastAsia="Aptos"/>
-          <w:color w:val="auto"/>
-          <w:kern w:val="2"/>
-          <w:szCs w:val="22"/>
-          <w:lang w:eastAsia="en-US"/>
-        </w:rPr>
-        <w:t>4.2. Resultats de l’EDA</w:t>
-      </w:r>
-    </w:p>
-    <w:p>
-      <w:pPr>
-        <w:spacing w:line="300" w:lineRule="auto"/>
-        <w:rPr>
-          <w:rFonts w:eastAsia="Aptos"/>
-          <w:color w:val="auto"/>
-          <w:kern w:val="2"/>
-          <w:szCs w:val="22"/>
-          <w:lang w:eastAsia="en-US"/>
-        </w:rPr>
-      </w:pPr>
-      <w:r>
-        <w:rPr>
-          <w:rFonts w:eastAsia="Aptos"/>
-          <w:color w:val="auto"/>
-          <w:kern w:val="2"/>
-          <w:szCs w:val="22"/>
-          <w:lang w:eastAsia="en-US"/>
-        </w:rPr>
-        <w:t>Associacions categòriques</w:t>
-      </w:r>
-    </w:p>
-    <w:p>
-      <w:pPr>
-        <w:spacing w:line="300" w:lineRule="auto"/>
-        <w:rPr>
-          <w:rFonts w:eastAsia="Aptos"/>
-          <w:color w:val="auto"/>
-          <w:kern w:val="2"/>
-          <w:szCs w:val="22"/>
-          <w:lang w:eastAsia="en-US"/>
-        </w:rPr>
-      </w:pPr>
-      <w:r>
-        <w:rPr>
-          <w:rFonts w:eastAsia="Aptos"/>
-          <w:color w:val="auto"/>
-          <w:kern w:val="2"/>
-          <w:szCs w:val="22"/>
-          <w:lang w:eastAsia="en-US"/>
-        </w:rPr>
-        <w:t>Correlacions numèriques</w:t>
-      </w:r>
-    </w:p>
-    <w:p>
-      <w:pPr>
-        <w:spacing w:line="300" w:lineRule="auto"/>
-        <w:rPr>
-          <w:rFonts w:eastAsia="Aptos"/>
-          <w:color w:val="auto"/>
-          <w:kern w:val="2"/>
-          <w:szCs w:val="22"/>
-          <w:lang w:eastAsia="en-US"/>
-        </w:rPr>
-      </w:pPr>
-      <w:r>
-        <w:rPr>
-          <w:rFonts w:eastAsia="Aptos"/>
-          <w:color w:val="auto"/>
-          <w:kern w:val="2"/>
-          <w:szCs w:val="22"/>
-          <w:lang w:eastAsia="en-US"/>
-        </w:rPr>
-        <w:t>Variables de percepció</w:t>
-      </w:r>
-    </w:p>
-    <w:p>
-      <w:pPr>
-        <w:spacing w:line="300" w:lineRule="auto"/>
-        <w:rPr>
-          <w:rFonts w:eastAsia="Aptos"/>
-          <w:color w:val="auto"/>
-          <w:kern w:val="2"/>
-          <w:szCs w:val="22"/>
-          <w:lang w:eastAsia="en-US"/>
-        </w:rPr>
-      </w:pPr>
-      <w:r>
-        <w:rPr>
-          <w:rFonts w:eastAsia="Aptos"/>
-          <w:color w:val="auto"/>
-          <w:kern w:val="2"/>
-          <w:szCs w:val="22"/>
-          <w:lang w:eastAsia="en-US"/>
-        </w:rPr>
-        <w:t>4.3. Resultats de l’EFA</w:t>
-      </w:r>
-    </w:p>
-    <w:p>
-      <w:pPr>
-        <w:spacing w:line="300" w:lineRule="auto"/>
-        <w:rPr>
-          <w:rFonts w:eastAsia="Aptos"/>
-          <w:color w:val="auto"/>
-          <w:kern w:val="2"/>
-          <w:szCs w:val="22"/>
-          <w:lang w:eastAsia="en-US"/>
-        </w:rPr>
-      </w:pPr>
-      <w:r>
-        <w:rPr>
-          <w:rFonts w:eastAsia="Aptos"/>
-          <w:color w:val="auto"/>
-          <w:kern w:val="2"/>
-          <w:szCs w:val="22"/>
-          <w:lang w:eastAsia="en-US"/>
-        </w:rPr>
-        <w:t>4.3.1. Bloc motius de no assistència</w:t>
-      </w:r>
-    </w:p>
-    <w:p>
-      <w:pPr>
-        <w:spacing w:line="300" w:lineRule="auto"/>
-        <w:rPr>
-          <w:rFonts w:eastAsia="Aptos"/>
-          <w:color w:val="auto"/>
-          <w:kern w:val="2"/>
-          <w:szCs w:val="22"/>
-          <w:lang w:eastAsia="en-US"/>
-        </w:rPr>
-      </w:pPr>
-      <w:r>
-        <w:rPr>
-          <w:rFonts w:eastAsia="Aptos"/>
-          <w:color w:val="auto"/>
-          <w:kern w:val="2"/>
-          <w:szCs w:val="22"/>
-          <w:lang w:eastAsia="en-US"/>
-        </w:rPr>
-        <w:t>4.3.2. Bloc estratègies docents</w:t>
-      </w:r>
-    </w:p>
-    <w:p>
-      <w:pPr>
-        <w:spacing w:line="300" w:lineRule="auto"/>
-        <w:rPr>
-          <w:rFonts w:eastAsia="Aptos"/>
-          <w:color w:val="auto"/>
-          <w:kern w:val="2"/>
-          <w:szCs w:val="22"/>
-          <w:lang w:eastAsia="en-US"/>
-        </w:rPr>
-      </w:pPr>
-      <w:r>
-        <w:rPr>
-          <w:rFonts w:eastAsia="Aptos"/>
-          <w:color w:val="auto"/>
-          <w:kern w:val="2"/>
-          <w:szCs w:val="22"/>
-          <w:lang w:eastAsia="en-US"/>
-        </w:rPr>
-        <w:t>4.3.3. Bloc ús de la IA</w:t>
-      </w:r>
-    </w:p>
-    <w:p>
-      <w:pPr>
-        <w:spacing w:line="300" w:lineRule="auto"/>
-        <w:rPr>
-          <w:rFonts w:eastAsia="Aptos"/>
-          <w:color w:val="auto"/>
-          <w:kern w:val="2"/>
-          <w:szCs w:val="22"/>
-          <w:lang w:eastAsia="en-US"/>
-        </w:rPr>
-      </w:pPr>
-      <w:r>
-        <w:rPr>
-          <w:rFonts w:eastAsia="Aptos"/>
-          <w:color w:val="auto"/>
-          <w:kern w:val="2"/>
-          <w:szCs w:val="22"/>
-          <w:lang w:eastAsia="en-US"/>
-        </w:rPr>
-        <w:t>Factors finals</w:t>
-      </w:r>
-    </w:p>
-    <w:p>
-      <w:pPr>
-        <w:spacing w:line="300" w:lineRule="auto"/>
-        <w:rPr>
-          <w:rFonts w:eastAsia="Aptos"/>
-          <w:color w:val="auto"/>
-          <w:kern w:val="2"/>
-          <w:szCs w:val="22"/>
-          <w:lang w:eastAsia="en-US"/>
-        </w:rPr>
-      </w:pPr>
-      <w:r>
-        <w:rPr>
-          <w:rFonts w:eastAsia="Aptos"/>
-          <w:color w:val="auto"/>
-          <w:kern w:val="2"/>
-          <w:szCs w:val="22"/>
-          <w:lang w:eastAsia="en-US"/>
-        </w:rPr>
-        <w:t>Variància explicada</w:t>
-      </w:r>
-    </w:p>
-    <w:p>
-      <w:pPr>
-        <w:spacing w:line="300" w:lineRule="auto"/>
-        <w:rPr>
-          <w:rFonts w:eastAsia="Aptos"/>
-          <w:color w:val="auto"/>
-          <w:kern w:val="2"/>
-          <w:szCs w:val="22"/>
-          <w:lang w:eastAsia="en-US"/>
-        </w:rPr>
-      </w:pPr>
-      <w:r>
-        <w:rPr>
-          <w:rFonts w:eastAsia="Aptos"/>
-          <w:color w:val="auto"/>
-          <w:kern w:val="2"/>
-          <w:szCs w:val="22"/>
-          <w:lang w:eastAsia="en-US"/>
-        </w:rPr>
-        <w:t>Interpretació</w:t>
-      </w:r>
-    </w:p>
-    <w:p>
-      <w:pPr>
-        <w:spacing w:line="300" w:lineRule="auto"/>
-        <w:rPr>
-          <w:rFonts w:eastAsia="Aptos"/>
-          <w:color w:val="auto"/>
-          <w:kern w:val="2"/>
-          <w:szCs w:val="22"/>
-          <w:lang w:eastAsia="en-US"/>
-        </w:rPr>
-      </w:pPr>
-      <w:r>
-        <w:rPr>
-          <w:rFonts w:eastAsia="Aptos"/>
-          <w:color w:val="auto"/>
-          <w:kern w:val="2"/>
-          <w:szCs w:val="22"/>
-          <w:lang w:eastAsia="en-US"/>
-        </w:rPr>
-        <w:t>4.4. Resultats del model logístic</w:t>
-      </w:r>
-    </w:p>
-    <w:p>
-      <w:pPr>
-        <w:spacing w:line="300" w:lineRule="auto"/>
-        <w:rPr>
-          <w:rFonts w:eastAsia="Aptos"/>
-          <w:color w:val="auto"/>
-          <w:kern w:val="2"/>
-          <w:szCs w:val="22"/>
-          <w:lang w:eastAsia="en-US"/>
-        </w:rPr>
-      </w:pPr>
-      <w:r>
-        <w:rPr>
-          <w:rFonts w:eastAsia="Aptos"/>
-          <w:color w:val="auto"/>
-          <w:kern w:val="2"/>
-          <w:szCs w:val="22"/>
-          <w:lang w:eastAsia="en-US"/>
-        </w:rPr>
-        <w:t>Coeficients</w:t>
-      </w:r>
-    </w:p>
-    <w:p>
-      <w:pPr>
-        <w:spacing w:line="300" w:lineRule="auto"/>
-        <w:rPr>
-          <w:rFonts w:eastAsia="Aptos"/>
-          <w:color w:val="auto"/>
-          <w:kern w:val="2"/>
-          <w:szCs w:val="22"/>
-          <w:lang w:eastAsia="en-US"/>
-        </w:rPr>
-      </w:pPr>
-      <w:r>
-        <w:rPr>
-          <w:rFonts w:eastAsia="Aptos"/>
-          <w:color w:val="auto"/>
-          <w:kern w:val="2"/>
-          <w:szCs w:val="22"/>
-          <w:lang w:eastAsia="en-US"/>
-        </w:rPr>
-        <w:t>Significació</w:t>
-      </w:r>
-    </w:p>
-    <w:p>
-      <w:pPr>
-        <w:spacing w:line="300" w:lineRule="auto"/>
-        <w:rPr>
-          <w:rFonts w:eastAsia="Aptos"/>
-          <w:color w:val="auto"/>
-          <w:kern w:val="2"/>
-          <w:szCs w:val="22"/>
-          <w:lang w:eastAsia="en-US"/>
-        </w:rPr>
-      </w:pPr>
-      <w:r>
-        <w:rPr>
-          <w:rFonts w:eastAsia="Aptos"/>
-          <w:color w:val="auto"/>
-          <w:kern w:val="2"/>
-          <w:szCs w:val="22"/>
-          <w:lang w:eastAsia="en-US"/>
-        </w:rPr>
-        <w:t>Odds ratios</w:t>
-      </w:r>
-    </w:p>
-    <w:p>
-      <w:pPr>
-        <w:spacing w:line="300" w:lineRule="auto"/>
-        <w:rPr>
-          <w:rFonts w:eastAsia="Aptos"/>
-          <w:color w:val="auto"/>
-          <w:kern w:val="2"/>
-          <w:szCs w:val="22"/>
-          <w:lang w:eastAsia="en-US"/>
-        </w:rPr>
-      </w:pPr>
-      <w:r>
-        <w:rPr>
-          <w:rFonts w:eastAsia="Aptos"/>
-          <w:color w:val="auto"/>
-          <w:kern w:val="2"/>
-          <w:szCs w:val="22"/>
-          <w:lang w:eastAsia="en-US"/>
-        </w:rPr>
-        <w:t>Interpretació</w:t>
-      </w:r>
-    </w:p>
-    <w:p>
-      <w:pPr>
-        <w:spacing w:line="300" w:lineRule="auto"/>
-        <w:rPr>
-          <w:rFonts w:eastAsia="Aptos"/>
-          <w:color w:val="auto"/>
-          <w:kern w:val="2"/>
-          <w:szCs w:val="22"/>
-          <w:lang w:eastAsia="en-US"/>
-        </w:rPr>
-      </w:pPr>
-      <w:r>
-        <w:rPr>
-          <w:rFonts w:eastAsia="Aptos"/>
-          <w:color w:val="auto"/>
-          <w:kern w:val="2"/>
-          <w:szCs w:val="22"/>
-          <w:lang w:eastAsia="en-US"/>
-        </w:rPr>
-        <w:t>4.5. Validació del model</w:t>
-      </w:r>
-    </w:p>
-    <w:p>
-      <w:pPr>
-        <w:spacing w:line="300" w:lineRule="auto"/>
-        <w:rPr>
-          <w:rFonts w:eastAsia="Aptos"/>
-          <w:color w:val="auto"/>
-          <w:kern w:val="2"/>
-          <w:szCs w:val="22"/>
-          <w:lang w:eastAsia="en-US"/>
-        </w:rPr>
-      </w:pPr>
-      <w:r>
-        <w:rPr>
-          <w:rFonts w:eastAsia="Aptos"/>
-          <w:color w:val="auto"/>
-          <w:kern w:val="2"/>
-          <w:szCs w:val="22"/>
-          <w:lang w:eastAsia="en-US"/>
-        </w:rPr>
-        <w:t>AUC / ROC</w:t>
-      </w:r>
-    </w:p>
-    <w:p>
-      <w:pPr>
-        <w:spacing w:line="300" w:lineRule="auto"/>
-        <w:rPr>
-          <w:rFonts w:eastAsia="Aptos"/>
-          <w:color w:val="auto"/>
-          <w:kern w:val="2"/>
-          <w:szCs w:val="22"/>
-          <w:lang w:eastAsia="en-US"/>
-        </w:rPr>
-      </w:pPr>
-      <w:r>
-        <w:rPr>
-          <w:rFonts w:eastAsia="Aptos"/>
-          <w:color w:val="auto"/>
-          <w:kern w:val="2"/>
-          <w:szCs w:val="22"/>
-          <w:lang w:eastAsia="en-US"/>
-        </w:rPr>
-        <w:t>Accuracy / confusion matrix</w:t>
-      </w:r>
-    </w:p>
-    <w:p>
-      <w:pPr>
-        <w:spacing w:line="300" w:lineRule="auto"/>
-        <w:rPr>
-          <w:rFonts w:eastAsia="Aptos"/>
-          <w:color w:val="auto"/>
-          <w:kern w:val="2"/>
-          <w:szCs w:val="22"/>
-          <w:lang w:eastAsia="en-US"/>
-        </w:rPr>
-      </w:pPr>
-      <w:r>
-        <w:rPr>
-          <w:rFonts w:eastAsia="Aptos"/>
-          <w:color w:val="auto"/>
-          <w:kern w:val="2"/>
-          <w:szCs w:val="22"/>
-          <w:lang w:eastAsia="en-US"/>
-        </w:rPr>
-        <w:t>Pseudo-R²</w:t>
-      </w:r>
-    </w:p>
-    <w:p>
-      <w:pPr>
-        <w:spacing w:line="300" w:lineRule="auto"/>
-        <w:rPr>
-          <w:rFonts w:eastAsia="Aptos"/>
-          <w:color w:val="auto"/>
-          <w:kern w:val="2"/>
-          <w:szCs w:val="22"/>
-          <w:lang w:eastAsia="en-US"/>
-        </w:rPr>
-      </w:pPr>
-      <w:r>
-        <w:rPr>
-          <w:rFonts w:eastAsia="Aptos"/>
-          <w:color w:val="auto"/>
-          <w:kern w:val="2"/>
-          <w:szCs w:val="22"/>
-          <w:lang w:eastAsia="en-US"/>
-        </w:rPr>
-        <w:lastRenderedPageBreak/>
-        <w:t>Capacitat predictiva</w:t>
-      </w:r>
-    </w:p>
-    <w:p>
-      <w:pPr>
-        <w:spacing w:after="0" w:line="240" w:lineRule="auto"/>
-        <w:rPr>
-          <w:rFonts w:eastAsia="Aptos"/>
-          <w:color w:val="auto"/>
-          <w:kern w:val="2"/>
-          <w:szCs w:val="22"/>
-          <w:lang w:eastAsia="en-US"/>
-        </w:rPr>
-      </w:pPr>
       <w:r>
         <w:rPr>
           <w:rFonts w:eastAsia="Aptos"/>
@@ -15439,7 +14582,7 @@
                     </pic:cNvPicPr>
                   </pic:nvPicPr>
                   <pic:blipFill>
-                    <a:blip r:embed="rId13" cstate="print">
+                    <a:blip r:embed="rId14" cstate="print">
                       <a:extLst>
                         <a:ext uri="{28A0092B-C50C-407E-A947-70E740481C1C}">
                           <a14:useLocalDpi xmlns:a14="http://schemas.microsoft.com/office/drawing/2010/main" val="0"/>
@@ -15654,7 +14797,7 @@
                     </pic:cNvPicPr>
                   </pic:nvPicPr>
                   <pic:blipFill rotWithShape="1">
-                    <a:blip r:embed="rId14" cstate="print">
+                    <a:blip r:embed="rId15" cstate="print">
                       <a:extLst>
                         <a:ext uri="{28A0092B-C50C-407E-A947-70E740481C1C}">
                           <a14:useLocalDpi xmlns:a14="http://schemas.microsoft.com/office/drawing/2010/main" val="0"/>
@@ -15914,7 +15057,7 @@
                     </pic:cNvPicPr>
                   </pic:nvPicPr>
                   <pic:blipFill>
-                    <a:blip r:embed="rId15" cstate="print">
+                    <a:blip r:embed="rId16" cstate="print">
                       <a:extLst>
                         <a:ext uri="{28A0092B-C50C-407E-A947-70E740481C1C}">
                           <a14:useLocalDpi xmlns:a14="http://schemas.microsoft.com/office/drawing/2010/main" val="0"/>
@@ -16054,7 +15197,7 @@
                           </pic:cNvPicPr>
                         </pic:nvPicPr>
                         <pic:blipFill rotWithShape="1">
-                          <a:blip r:embed="rId16" cstate="print">
+                          <a:blip r:embed="rId17" cstate="print">
                             <a:extLst>
                               <a:ext uri="{28A0092B-C50C-407E-A947-70E740481C1C}">
                                 <a14:useLocalDpi xmlns:a14="http://schemas.microsoft.com/office/drawing/2010/main" val="0"/>
@@ -16145,7 +15288,7 @@
                           </pic:cNvPicPr>
                         </pic:nvPicPr>
                         <pic:blipFill rotWithShape="1">
-                          <a:blip r:embed="rId17" cstate="print">
+                          <a:blip r:embed="rId18" cstate="print">
                             <a:extLst>
                               <a:ext uri="{28A0092B-C50C-407E-A947-70E740481C1C}">
                                 <a14:useLocalDpi xmlns:a14="http://schemas.microsoft.com/office/drawing/2010/main" val="0"/>
@@ -16581,7 +15724,7 @@
                     </pic:cNvPicPr>
                   </pic:nvPicPr>
                   <pic:blipFill rotWithShape="1">
-                    <a:blip r:embed="rId18" cstate="print">
+                    <a:blip r:embed="rId19" cstate="print">
                       <a:extLst>
                         <a:ext uri="{28A0092B-C50C-407E-A947-70E740481C1C}">
                           <a14:useLocalDpi xmlns:a14="http://schemas.microsoft.com/office/drawing/2010/main" val="0"/>
@@ -16777,7 +15920,7 @@
                     </pic:cNvPicPr>
                   </pic:nvPicPr>
                   <pic:blipFill rotWithShape="1">
-                    <a:blip r:embed="rId19" cstate="print">
+                    <a:blip r:embed="rId20" cstate="print">
                       <a:extLst>
                         <a:ext uri="{28A0092B-C50C-407E-A947-70E740481C1C}">
                           <a14:useLocalDpi xmlns:a14="http://schemas.microsoft.com/office/drawing/2010/main" val="0"/>
@@ -17023,7 +16166,7 @@
                     </pic:cNvPicPr>
                   </pic:nvPicPr>
                   <pic:blipFill rotWithShape="1">
-                    <a:blip r:embed="rId20" cstate="print">
+                    <a:blip r:embed="rId21" cstate="print">
                       <a:extLst>
                         <a:ext uri="{28A0092B-C50C-407E-A947-70E740481C1C}">
                           <a14:useLocalDpi xmlns:a14="http://schemas.microsoft.com/office/drawing/2010/main" val="0"/>
@@ -17315,7 +16458,7 @@
                     </pic:cNvPicPr>
                   </pic:nvPicPr>
                   <pic:blipFill rotWithShape="1">
-                    <a:blip r:embed="rId21" cstate="print">
+                    <a:blip r:embed="rId22" cstate="print">
                       <a:extLst>
                         <a:ext uri="{28A0092B-C50C-407E-A947-70E740481C1C}">
                           <a14:useLocalDpi xmlns:a14="http://schemas.microsoft.com/office/drawing/2010/main" val="0"/>
@@ -18021,7 +17164,7 @@
                     </pic:cNvPicPr>
                   </pic:nvPicPr>
                   <pic:blipFill rotWithShape="1">
-                    <a:blip r:embed="rId22" cstate="print">
+                    <a:blip r:embed="rId23" cstate="print">
                       <a:extLst>
                         <a:ext uri="{28A0092B-C50C-407E-A947-70E740481C1C}">
                           <a14:useLocalDpi xmlns:a14="http://schemas.microsoft.com/office/drawing/2010/main" val="0"/>
@@ -18326,7 +17469,7 @@
                     <pic:cNvPicPr/>
                   </pic:nvPicPr>
                   <pic:blipFill rotWithShape="1">
-                    <a:blip r:embed="rId23"/>
+                    <a:blip r:embed="rId24"/>
                     <a:srcRect t="3637"/>
                     <a:stretch>
                       <a:fillRect/>
@@ -19326,7 +18469,7 @@
                     </pic:cNvPicPr>
                   </pic:nvPicPr>
                   <pic:blipFill rotWithShape="1">
-                    <a:blip r:embed="rId24" cstate="print">
+                    <a:blip r:embed="rId25" cstate="print">
                       <a:extLst>
                         <a:ext uri="{28A0092B-C50C-407E-A947-70E740481C1C}">
                           <a14:useLocalDpi xmlns:a14="http://schemas.microsoft.com/office/drawing/2010/main" val="0"/>
@@ -19635,7 +18778,7 @@
                     </pic:cNvPicPr>
                   </pic:nvPicPr>
                   <pic:blipFill>
-                    <a:blip r:embed="rId25" cstate="print">
+                    <a:blip r:embed="rId26" cstate="print">
                       <a:extLst>
                         <a:ext uri="{28A0092B-C50C-407E-A947-70E740481C1C}">
                           <a14:useLocalDpi xmlns:a14="http://schemas.microsoft.com/office/drawing/2010/main" val="0"/>
@@ -19786,7 +18929,7 @@
                     </pic:cNvPicPr>
                   </pic:nvPicPr>
                   <pic:blipFill rotWithShape="1">
-                    <a:blip r:embed="rId26" cstate="print">
+                    <a:blip r:embed="rId27" cstate="print">
                       <a:extLst>
                         <a:ext uri="{28A0092B-C50C-407E-A947-70E740481C1C}">
                           <a14:useLocalDpi xmlns:a14="http://schemas.microsoft.com/office/drawing/2010/main" val="0"/>
@@ -21505,7 +20648,7 @@
                     </pic:cNvPicPr>
                   </pic:nvPicPr>
                   <pic:blipFill rotWithShape="1">
-                    <a:blip r:embed="rId27" cstate="print">
+                    <a:blip r:embed="rId28" cstate="print">
                       <a:extLst>
                         <a:ext uri="{28A0092B-C50C-407E-A947-70E740481C1C}">
                           <a14:useLocalDpi xmlns:a14="http://schemas.microsoft.com/office/drawing/2010/main" val="0"/>
@@ -22790,7 +21933,19 @@
               <w:rPr>
                 <w:rFonts w:eastAsia="Aptos"/>
               </w:rPr>
-              <w:t>−1.859</w:t>
+              <w:t>−1</w:t>
+            </w:r>
+            <w:r>
+              <w:rPr>
+                <w:rFonts w:eastAsia="Aptos"/>
+              </w:rPr>
+              <w:t>,</w:t>
+            </w:r>
+            <w:r>
+              <w:rPr>
+                <w:rFonts w:eastAsia="Aptos"/>
+              </w:rPr>
+              <w:t>859</w:t>
             </w:r>
           </w:p>
         </w:tc>
@@ -22811,7 +21966,19 @@
               <w:rPr>
                 <w:rFonts w:eastAsia="Aptos"/>
               </w:rPr>
-              <w:t>0.845</w:t>
+              <w:t>0</w:t>
+            </w:r>
+            <w:r>
+              <w:rPr>
+                <w:rFonts w:eastAsia="Aptos"/>
+              </w:rPr>
+              <w:t>,</w:t>
+            </w:r>
+            <w:r>
+              <w:rPr>
+                <w:rFonts w:eastAsia="Aptos"/>
+              </w:rPr>
+              <w:t>845</w:t>
             </w:r>
           </w:p>
         </w:tc>
@@ -22832,7 +21999,19 @@
               <w:rPr>
                 <w:rFonts w:eastAsia="Aptos"/>
               </w:rPr>
-              <w:t>−2.20</w:t>
+              <w:t>−2</w:t>
+            </w:r>
+            <w:r>
+              <w:rPr>
+                <w:rFonts w:eastAsia="Aptos"/>
+              </w:rPr>
+              <w:t>,</w:t>
+            </w:r>
+            <w:r>
+              <w:rPr>
+                <w:rFonts w:eastAsia="Aptos"/>
+              </w:rPr>
+              <w:t>20</w:t>
             </w:r>
           </w:p>
         </w:tc>
@@ -22853,7 +22032,19 @@
               <w:rPr>
                 <w:rFonts w:eastAsia="Aptos"/>
               </w:rPr>
-              <w:t>0.028 *</w:t>
+              <w:t>0</w:t>
+            </w:r>
+            <w:r>
+              <w:rPr>
+                <w:rFonts w:eastAsia="Aptos"/>
+              </w:rPr>
+              <w:t>,</w:t>
+            </w:r>
+            <w:r>
+              <w:rPr>
+                <w:rFonts w:eastAsia="Aptos"/>
+              </w:rPr>
+              <w:t>028 *</w:t>
             </w:r>
           </w:p>
         </w:tc>
@@ -22898,7 +22089,19 @@
               <w:rPr>
                 <w:rFonts w:eastAsia="Aptos"/>
               </w:rPr>
-              <w:t>−0.722</w:t>
+              <w:t>−0</w:t>
+            </w:r>
+            <w:r>
+              <w:rPr>
+                <w:rFonts w:eastAsia="Aptos"/>
+              </w:rPr>
+              <w:t>,</w:t>
+            </w:r>
+            <w:r>
+              <w:rPr>
+                <w:rFonts w:eastAsia="Aptos"/>
+              </w:rPr>
+              <w:t>722</w:t>
             </w:r>
           </w:p>
         </w:tc>
@@ -22920,7 +22123,19 @@
               <w:rPr>
                 <w:rFonts w:eastAsia="Aptos"/>
               </w:rPr>
-              <w:t>0.206</w:t>
+              <w:t>0</w:t>
+            </w:r>
+            <w:r>
+              <w:rPr>
+                <w:rFonts w:eastAsia="Aptos"/>
+              </w:rPr>
+              <w:t>,</w:t>
+            </w:r>
+            <w:r>
+              <w:rPr>
+                <w:rFonts w:eastAsia="Aptos"/>
+              </w:rPr>
+              <w:t>206</w:t>
             </w:r>
           </w:p>
         </w:tc>
@@ -22942,7 +22157,19 @@
               <w:rPr>
                 <w:rFonts w:eastAsia="Aptos"/>
               </w:rPr>
-              <w:t>−3.51</w:t>
+              <w:t>−3</w:t>
+            </w:r>
+            <w:r>
+              <w:rPr>
+                <w:rFonts w:eastAsia="Aptos"/>
+              </w:rPr>
+              <w:t>,</w:t>
+            </w:r>
+            <w:r>
+              <w:rPr>
+                <w:rFonts w:eastAsia="Aptos"/>
+              </w:rPr>
+              <w:t>51</w:t>
             </w:r>
           </w:p>
         </w:tc>
@@ -22963,7 +22190,19 @@
               <w:rPr>
                 <w:rFonts w:eastAsia="Aptos"/>
               </w:rPr>
-              <w:t>&lt;0.001 ***</w:t>
+              <w:t>&lt;0</w:t>
+            </w:r>
+            <w:r>
+              <w:rPr>
+                <w:rFonts w:eastAsia="Aptos"/>
+              </w:rPr>
+              <w:t>,</w:t>
+            </w:r>
+            <w:r>
+              <w:rPr>
+                <w:rFonts w:eastAsia="Aptos"/>
+              </w:rPr>
+              <w:t>001 ***</w:t>
             </w:r>
           </w:p>
         </w:tc>
@@ -23008,7 +22247,19 @@
               <w:rPr>
                 <w:rFonts w:eastAsia="Aptos"/>
               </w:rPr>
-              <w:t>0.293</w:t>
+              <w:t>0</w:t>
+            </w:r>
+            <w:r>
+              <w:rPr>
+                <w:rFonts w:eastAsia="Aptos"/>
+              </w:rPr>
+              <w:t>,</w:t>
+            </w:r>
+            <w:r>
+              <w:rPr>
+                <w:rFonts w:eastAsia="Aptos"/>
+              </w:rPr>
+              <w:t>293</w:t>
             </w:r>
           </w:p>
         </w:tc>
@@ -23030,7 +22281,19 @@
               <w:rPr>
                 <w:rFonts w:eastAsia="Aptos"/>
               </w:rPr>
-              <w:t>0.150</w:t>
+              <w:t>0</w:t>
+            </w:r>
+            <w:r>
+              <w:rPr>
+                <w:rFonts w:eastAsia="Aptos"/>
+              </w:rPr>
+              <w:t>,</w:t>
+            </w:r>
+            <w:r>
+              <w:rPr>
+                <w:rFonts w:eastAsia="Aptos"/>
+              </w:rPr>
+              <w:t>150</w:t>
             </w:r>
           </w:p>
         </w:tc>
@@ -23052,7 +22315,19 @@
               <w:rPr>
                 <w:rFonts w:eastAsia="Aptos"/>
               </w:rPr>
-              <w:t>1.95</w:t>
+              <w:t>1</w:t>
+            </w:r>
+            <w:r>
+              <w:rPr>
+                <w:rFonts w:eastAsia="Aptos"/>
+              </w:rPr>
+              <w:t>,</w:t>
+            </w:r>
+            <w:r>
+              <w:rPr>
+                <w:rFonts w:eastAsia="Aptos"/>
+              </w:rPr>
+              <w:t>95</w:t>
             </w:r>
           </w:p>
         </w:tc>
@@ -23073,7 +22348,19 @@
               <w:rPr>
                 <w:rFonts w:eastAsia="Aptos"/>
               </w:rPr>
-              <w:t>0.051 .</w:t>
+              <w:t>0</w:t>
+            </w:r>
+            <w:r>
+              <w:rPr>
+                <w:rFonts w:eastAsia="Aptos"/>
+              </w:rPr>
+              <w:t>,</w:t>
+            </w:r>
+            <w:r>
+              <w:rPr>
+                <w:rFonts w:eastAsia="Aptos"/>
+              </w:rPr>
+              <w:t>051 .</w:t>
             </w:r>
           </w:p>
         </w:tc>
@@ -23118,7 +22405,19 @@
               <w:rPr>
                 <w:rFonts w:eastAsia="Aptos"/>
               </w:rPr>
-              <w:t>0.518</w:t>
+              <w:t>0</w:t>
+            </w:r>
+            <w:r>
+              <w:rPr>
+                <w:rFonts w:eastAsia="Aptos"/>
+              </w:rPr>
+              <w:t>,</w:t>
+            </w:r>
+            <w:r>
+              <w:rPr>
+                <w:rFonts w:eastAsia="Aptos"/>
+              </w:rPr>
+              <w:t>518</w:t>
             </w:r>
           </w:p>
         </w:tc>
@@ -23140,7 +22439,19 @@
               <w:rPr>
                 <w:rFonts w:eastAsia="Aptos"/>
               </w:rPr>
-              <w:t>0.165</w:t>
+              <w:t>0</w:t>
+            </w:r>
+            <w:r>
+              <w:rPr>
+                <w:rFonts w:eastAsia="Aptos"/>
+              </w:rPr>
+              <w:t>,</w:t>
+            </w:r>
+            <w:r>
+              <w:rPr>
+                <w:rFonts w:eastAsia="Aptos"/>
+              </w:rPr>
+              <w:t>165</w:t>
             </w:r>
           </w:p>
         </w:tc>
@@ -23162,7 +22473,19 @@
               <w:rPr>
                 <w:rFonts w:eastAsia="Aptos"/>
               </w:rPr>
-              <w:t>3.13</w:t>
+              <w:t>3</w:t>
+            </w:r>
+            <w:r>
+              <w:rPr>
+                <w:rFonts w:eastAsia="Aptos"/>
+              </w:rPr>
+              <w:t>,</w:t>
+            </w:r>
+            <w:r>
+              <w:rPr>
+                <w:rFonts w:eastAsia="Aptos"/>
+              </w:rPr>
+              <w:t>13</w:t>
             </w:r>
           </w:p>
         </w:tc>
@@ -23183,7 +22506,19 @@
               <w:rPr>
                 <w:rFonts w:eastAsia="Aptos"/>
               </w:rPr>
-              <w:t>0.002 **</w:t>
+              <w:t>0</w:t>
+            </w:r>
+            <w:r>
+              <w:rPr>
+                <w:rFonts w:eastAsia="Aptos"/>
+              </w:rPr>
+              <w:t>,</w:t>
+            </w:r>
+            <w:r>
+              <w:rPr>
+                <w:rFonts w:eastAsia="Aptos"/>
+              </w:rPr>
+              <w:t>002 **</w:t>
             </w:r>
           </w:p>
         </w:tc>
@@ -23228,7 +22563,19 @@
               <w:rPr>
                 <w:rFonts w:eastAsia="Aptos"/>
               </w:rPr>
-              <w:t>−0.346</w:t>
+              <w:t>−0</w:t>
+            </w:r>
+            <w:r>
+              <w:rPr>
+                <w:rFonts w:eastAsia="Aptos"/>
+              </w:rPr>
+              <w:t>,</w:t>
+            </w:r>
+            <w:r>
+              <w:rPr>
+                <w:rFonts w:eastAsia="Aptos"/>
+              </w:rPr>
+              <w:t>346</w:t>
             </w:r>
           </w:p>
         </w:tc>
@@ -23250,7 +22597,19 @@
               <w:rPr>
                 <w:rFonts w:eastAsia="Aptos"/>
               </w:rPr>
-              <w:t>0.101</w:t>
+              <w:t>0</w:t>
+            </w:r>
+            <w:r>
+              <w:rPr>
+                <w:rFonts w:eastAsia="Aptos"/>
+              </w:rPr>
+              <w:t>,</w:t>
+            </w:r>
+            <w:r>
+              <w:rPr>
+                <w:rFonts w:eastAsia="Aptos"/>
+              </w:rPr>
+              <w:t>101</w:t>
             </w:r>
           </w:p>
         </w:tc>
@@ -23272,7 +22631,19 @@
               <w:rPr>
                 <w:rFonts w:eastAsia="Aptos"/>
               </w:rPr>
-              <w:t>−3.44</w:t>
+              <w:t>−3</w:t>
+            </w:r>
+            <w:r>
+              <w:rPr>
+                <w:rFonts w:eastAsia="Aptos"/>
+              </w:rPr>
+              <w:t>,</w:t>
+            </w:r>
+            <w:r>
+              <w:rPr>
+                <w:rFonts w:eastAsia="Aptos"/>
+              </w:rPr>
+              <w:t>44</w:t>
             </w:r>
           </w:p>
         </w:tc>
@@ -23293,7 +22664,19 @@
               <w:rPr>
                 <w:rFonts w:eastAsia="Aptos"/>
               </w:rPr>
-              <w:t>&lt;0.001 ***</w:t>
+              <w:t>&lt;0</w:t>
+            </w:r>
+            <w:r>
+              <w:rPr>
+                <w:rFonts w:eastAsia="Aptos"/>
+              </w:rPr>
+              <w:t>,</w:t>
+            </w:r>
+            <w:r>
+              <w:rPr>
+                <w:rFonts w:eastAsia="Aptos"/>
+              </w:rPr>
+              <w:t>001 ***</w:t>
             </w:r>
           </w:p>
         </w:tc>
@@ -23338,7 +22721,19 @@
               <w:rPr>
                 <w:rFonts w:eastAsia="Aptos"/>
               </w:rPr>
-              <w:t>1.580</w:t>
+              <w:t>1</w:t>
+            </w:r>
+            <w:r>
+              <w:rPr>
+                <w:rFonts w:eastAsia="Aptos"/>
+              </w:rPr>
+              <w:t>,</w:t>
+            </w:r>
+            <w:r>
+              <w:rPr>
+                <w:rFonts w:eastAsia="Aptos"/>
+              </w:rPr>
+              <w:t>580</w:t>
             </w:r>
           </w:p>
         </w:tc>
@@ -23360,7 +22755,19 @@
               <w:rPr>
                 <w:rFonts w:eastAsia="Aptos"/>
               </w:rPr>
-              <w:t>0.708</w:t>
+              <w:t>0</w:t>
+            </w:r>
+            <w:r>
+              <w:rPr>
+                <w:rFonts w:eastAsia="Aptos"/>
+              </w:rPr>
+              <w:t>,</w:t>
+            </w:r>
+            <w:r>
+              <w:rPr>
+                <w:rFonts w:eastAsia="Aptos"/>
+              </w:rPr>
+              <w:t>708</w:t>
             </w:r>
           </w:p>
         </w:tc>
@@ -23382,7 +22789,19 @@
               <w:rPr>
                 <w:rFonts w:eastAsia="Aptos"/>
               </w:rPr>
-              <w:t>2.23</w:t>
+              <w:t>2</w:t>
+            </w:r>
+            <w:r>
+              <w:rPr>
+                <w:rFonts w:eastAsia="Aptos"/>
+              </w:rPr>
+              <w:t>,</w:t>
+            </w:r>
+            <w:r>
+              <w:rPr>
+                <w:rFonts w:eastAsia="Aptos"/>
+              </w:rPr>
+              <w:t>23</w:t>
             </w:r>
           </w:p>
         </w:tc>
@@ -23403,7 +22822,19 @@
               <w:rPr>
                 <w:rFonts w:eastAsia="Aptos"/>
               </w:rPr>
-              <w:t>0.026 *</w:t>
+              <w:t>0</w:t>
+            </w:r>
+            <w:r>
+              <w:rPr>
+                <w:rFonts w:eastAsia="Aptos"/>
+              </w:rPr>
+              <w:t>,</w:t>
+            </w:r>
+            <w:r>
+              <w:rPr>
+                <w:rFonts w:eastAsia="Aptos"/>
+              </w:rPr>
+              <w:t>026 *</w:t>
             </w:r>
           </w:p>
         </w:tc>
@@ -23448,7 +22879,19 @@
               <w:rPr>
                 <w:rFonts w:eastAsia="Aptos"/>
               </w:rPr>
-              <w:t>1.108</w:t>
+              <w:t>1</w:t>
+            </w:r>
+            <w:r>
+              <w:rPr>
+                <w:rFonts w:eastAsia="Aptos"/>
+              </w:rPr>
+              <w:t>,</w:t>
+            </w:r>
+            <w:r>
+              <w:rPr>
+                <w:rFonts w:eastAsia="Aptos"/>
+              </w:rPr>
+              <w:t>108</w:t>
             </w:r>
           </w:p>
         </w:tc>
@@ -23470,7 +22913,19 @@
               <w:rPr>
                 <w:rFonts w:eastAsia="Aptos"/>
               </w:rPr>
-              <w:t>0.364</w:t>
+              <w:t>0</w:t>
+            </w:r>
+            <w:r>
+              <w:rPr>
+                <w:rFonts w:eastAsia="Aptos"/>
+              </w:rPr>
+              <w:t>,</w:t>
+            </w:r>
+            <w:r>
+              <w:rPr>
+                <w:rFonts w:eastAsia="Aptos"/>
+              </w:rPr>
+              <w:t>364</w:t>
             </w:r>
           </w:p>
         </w:tc>
@@ -23492,7 +22947,19 @@
               <w:rPr>
                 <w:rFonts w:eastAsia="Aptos"/>
               </w:rPr>
-              <w:t>3.05</w:t>
+              <w:t>3</w:t>
+            </w:r>
+            <w:r>
+              <w:rPr>
+                <w:rFonts w:eastAsia="Aptos"/>
+              </w:rPr>
+              <w:t>,</w:t>
+            </w:r>
+            <w:r>
+              <w:rPr>
+                <w:rFonts w:eastAsia="Aptos"/>
+              </w:rPr>
+              <w:t>05</w:t>
             </w:r>
           </w:p>
         </w:tc>
@@ -23513,7 +22980,19 @@
               <w:rPr>
                 <w:rFonts w:eastAsia="Aptos"/>
               </w:rPr>
-              <w:t>0.002 **</w:t>
+              <w:t>0</w:t>
+            </w:r>
+            <w:r>
+              <w:rPr>
+                <w:rFonts w:eastAsia="Aptos"/>
+              </w:rPr>
+              <w:t>,</w:t>
+            </w:r>
+            <w:r>
+              <w:rPr>
+                <w:rFonts w:eastAsia="Aptos"/>
+              </w:rPr>
+              <w:t>002 **</w:t>
             </w:r>
           </w:p>
         </w:tc>
@@ -23558,7 +23037,19 @@
               <w:rPr>
                 <w:rFonts w:eastAsia="Aptos"/>
               </w:rPr>
-              <w:t>0.570</w:t>
+              <w:t>0</w:t>
+            </w:r>
+            <w:r>
+              <w:rPr>
+                <w:rFonts w:eastAsia="Aptos"/>
+              </w:rPr>
+              <w:t>,</w:t>
+            </w:r>
+            <w:r>
+              <w:rPr>
+                <w:rFonts w:eastAsia="Aptos"/>
+              </w:rPr>
+              <w:t>570</w:t>
             </w:r>
           </w:p>
         </w:tc>
@@ -23580,7 +23071,19 @@
               <w:rPr>
                 <w:rFonts w:eastAsia="Aptos"/>
               </w:rPr>
-              <w:t>0.181</w:t>
+              <w:t>0</w:t>
+            </w:r>
+            <w:r>
+              <w:rPr>
+                <w:rFonts w:eastAsia="Aptos"/>
+              </w:rPr>
+              <w:t>,</w:t>
+            </w:r>
+            <w:r>
+              <w:rPr>
+                <w:rFonts w:eastAsia="Aptos"/>
+              </w:rPr>
+              <w:t>181</w:t>
             </w:r>
           </w:p>
         </w:tc>
@@ -23602,7 +23105,19 @@
               <w:rPr>
                 <w:rFonts w:eastAsia="Aptos"/>
               </w:rPr>
-              <w:t>3.15</w:t>
+              <w:t>3</w:t>
+            </w:r>
+            <w:r>
+              <w:rPr>
+                <w:rFonts w:eastAsia="Aptos"/>
+              </w:rPr>
+              <w:t>,</w:t>
+            </w:r>
+            <w:r>
+              <w:rPr>
+                <w:rFonts w:eastAsia="Aptos"/>
+              </w:rPr>
+              <w:t>15</w:t>
             </w:r>
           </w:p>
         </w:tc>
@@ -23623,7 +23138,19 @@
               <w:rPr>
                 <w:rFonts w:eastAsia="Aptos"/>
               </w:rPr>
-              <w:t>0.002 **</w:t>
+              <w:t>0</w:t>
+            </w:r>
+            <w:r>
+              <w:rPr>
+                <w:rFonts w:eastAsia="Aptos"/>
+              </w:rPr>
+              <w:t>,</w:t>
+            </w:r>
+            <w:r>
+              <w:rPr>
+                <w:rFonts w:eastAsia="Aptos"/>
+              </w:rPr>
+              <w:t>002 **</w:t>
             </w:r>
           </w:p>
         </w:tc>
@@ -23668,7 +23195,19 @@
               <w:rPr>
                 <w:rFonts w:eastAsia="Aptos"/>
               </w:rPr>
-              <w:t>1.078</w:t>
+              <w:t>1</w:t>
+            </w:r>
+            <w:r>
+              <w:rPr>
+                <w:rFonts w:eastAsia="Aptos"/>
+              </w:rPr>
+              <w:t>,</w:t>
+            </w:r>
+            <w:r>
+              <w:rPr>
+                <w:rFonts w:eastAsia="Aptos"/>
+              </w:rPr>
+              <w:t>078</w:t>
             </w:r>
           </w:p>
         </w:tc>
@@ -23690,7 +23229,19 @@
               <w:rPr>
                 <w:rFonts w:eastAsia="Aptos"/>
               </w:rPr>
-              <w:t>0.378</w:t>
+              <w:t>0</w:t>
+            </w:r>
+            <w:r>
+              <w:rPr>
+                <w:rFonts w:eastAsia="Aptos"/>
+              </w:rPr>
+              <w:t>,</w:t>
+            </w:r>
+            <w:r>
+              <w:rPr>
+                <w:rFonts w:eastAsia="Aptos"/>
+              </w:rPr>
+              <w:t>378</w:t>
             </w:r>
           </w:p>
         </w:tc>
@@ -23712,7 +23263,19 @@
               <w:rPr>
                 <w:rFonts w:eastAsia="Aptos"/>
               </w:rPr>
-              <w:t>2.85</w:t>
+              <w:t>2</w:t>
+            </w:r>
+            <w:r>
+              <w:rPr>
+                <w:rFonts w:eastAsia="Aptos"/>
+              </w:rPr>
+              <w:t>,</w:t>
+            </w:r>
+            <w:r>
+              <w:rPr>
+                <w:rFonts w:eastAsia="Aptos"/>
+              </w:rPr>
+              <w:t>85</w:t>
             </w:r>
           </w:p>
         </w:tc>
@@ -23733,7 +23296,19 @@
               <w:rPr>
                 <w:rFonts w:eastAsia="Aptos"/>
               </w:rPr>
-              <w:t>0.004 **</w:t>
+              <w:t>0</w:t>
+            </w:r>
+            <w:r>
+              <w:rPr>
+                <w:rFonts w:eastAsia="Aptos"/>
+              </w:rPr>
+              <w:t>,</w:t>
+            </w:r>
+            <w:r>
+              <w:rPr>
+                <w:rFonts w:eastAsia="Aptos"/>
+              </w:rPr>
+              <w:t>004 **</w:t>
             </w:r>
           </w:p>
         </w:tc>
@@ -23750,7 +23325,19 @@
         <w:rPr>
           <w:lang w:eastAsia="en-US"/>
         </w:rPr>
-        <w:t xml:space="preserve">El model seleccionat s'estima sobre el conjunt d'entrenament (274 observacions). Tots els coeficients són estadísticament significatius al nivell del 5%, excepte MOT_FORCA_MAJOR, que ho és al 10% (p = 0.051). La reducció de </w:t>
+        <w:t>El model seleccionat s'estima sobre el conjunt d'entrenament (274 observacions). Tots els coeficients són estadísticament significatius al nivell del 5%, excepte MOT_FORCA_MAJOR, que ho és al 10% (p = 0</w:t>
+      </w:r>
+      <w:r>
+        <w:rPr>
+          <w:lang w:eastAsia="en-US"/>
+        </w:rPr>
+        <w:t>,</w:t>
+      </w:r>
+      <w:r>
+        <w:rPr>
+          <w:lang w:eastAsia="en-US"/>
+        </w:rPr>
+        <w:t xml:space="preserve">051). La reducció de </w:t>
       </w:r>
       <w:r>
         <w:rPr>
@@ -23762,7 +23349,43 @@
         <w:rPr>
           <w:lang w:eastAsia="en-US"/>
         </w:rPr>
-        <w:t xml:space="preserve"> respecte al model nul és notable —de 376.10 a 279.56, una reducció del 25.7%— indicant que el conjunt de predictors explica una part substancial de la variació en l'assistència.</w:t>
+        <w:t xml:space="preserve"> respecte al model nul és notable —de 376</w:t>
+      </w:r>
+      <w:r>
+        <w:rPr>
+          <w:lang w:eastAsia="en-US"/>
+        </w:rPr>
+        <w:t>,</w:t>
+      </w:r>
+      <w:r>
+        <w:rPr>
+          <w:lang w:eastAsia="en-US"/>
+        </w:rPr>
+        <w:t>10 a 279</w:t>
+      </w:r>
+      <w:r>
+        <w:rPr>
+          <w:lang w:eastAsia="en-US"/>
+        </w:rPr>
+        <w:t>,</w:t>
+      </w:r>
+      <w:r>
+        <w:rPr>
+          <w:lang w:eastAsia="en-US"/>
+        </w:rPr>
+        <w:t>56, una reducció del 25</w:t>
+      </w:r>
+      <w:r>
+        <w:rPr>
+          <w:lang w:eastAsia="en-US"/>
+        </w:rPr>
+        <w:t>,</w:t>
+      </w:r>
+      <w:r>
+        <w:rPr>
+          <w:lang w:eastAsia="en-US"/>
+        </w:rPr>
+        <w:t>7%— indicant que el conjunt de predictors explica una part substancial de la variació en l'assistència.</w:t>
       </w:r>
     </w:p>
     <w:p>
@@ -23794,7 +23417,31 @@
         <w:rPr>
           <w:lang w:eastAsia="en-US"/>
         </w:rPr>
-        <w:t>El model obté un AUC de 0.856 sobre el test, superior a la mitjana de validació creuada (0.801), cosa que descarta overfitting en la capacitat discriminativa global.</w:t>
+        <w:t>El model obté un AUC de 0</w:t>
+      </w:r>
+      <w:r>
+        <w:rPr>
+          <w:lang w:eastAsia="en-US"/>
+        </w:rPr>
+        <w:t>,</w:t>
+      </w:r>
+      <w:r>
+        <w:rPr>
+          <w:lang w:eastAsia="en-US"/>
+        </w:rPr>
+        <w:t>856 sobre el test, superior a la mitjana de validació creuada (0</w:t>
+      </w:r>
+      <w:r>
+        <w:rPr>
+          <w:lang w:eastAsia="en-US"/>
+        </w:rPr>
+        <w:t>,</w:t>
+      </w:r>
+      <w:r>
+        <w:rPr>
+          <w:lang w:eastAsia="en-US"/>
+        </w:rPr>
+        <w:t>801), cosa que descarta overfitting en la capacitat discriminativa global.</w:t>
       </w:r>
       <w:r>
         <w:rPr>
@@ -23877,7 +23524,7 @@
                     </pic:cNvPicPr>
                   </pic:nvPicPr>
                   <pic:blipFill rotWithShape="1">
-                    <a:blip r:embed="rId28" cstate="print">
+                    <a:blip r:embed="rId29" cstate="print">
                       <a:extLst>
                         <a:ext uri="{28A0092B-C50C-407E-A947-70E740481C1C}">
                           <a14:useLocalDpi xmlns:a14="http://schemas.microsoft.com/office/drawing/2010/main" val="0"/>
@@ -24324,7 +23971,13 @@
               <w:rPr>
                 <w:rFonts w:eastAsia="Aptos"/>
               </w:rPr>
-              <w:t>0,856</w:t>
+              <w:t>0,</w:t>
+            </w:r>
+            <w:r>
+              <w:rPr>
+                <w:rFonts w:eastAsia="Aptos"/>
+              </w:rPr>
+              <w:t>676</w:t>
             </w:r>
           </w:p>
         </w:tc>
@@ -25009,7 +24662,7 @@
                     </pic:cNvPicPr>
                   </pic:nvPicPr>
                   <pic:blipFill rotWithShape="1">
-                    <a:blip r:embed="rId29" cstate="print">
+                    <a:blip r:embed="rId30" cstate="print">
                       <a:extLst>
                         <a:ext uri="{28A0092B-C50C-407E-A947-70E740481C1C}">
                           <a14:useLocalDpi xmlns:a14="http://schemas.microsoft.com/office/drawing/2010/main" val="0"/>
@@ -25119,7 +24772,7 @@
                     </pic:cNvPicPr>
                   </pic:nvPicPr>
                   <pic:blipFill rotWithShape="1">
-                    <a:blip r:embed="rId30" cstate="print">
+                    <a:blip r:embed="rId31" cstate="print">
                       <a:extLst>
                         <a:ext uri="{28A0092B-C50C-407E-A947-70E740481C1C}">
                           <a14:useLocalDpi xmlns:a14="http://schemas.microsoft.com/office/drawing/2010/main" val="0"/>
@@ -27094,7 +26747,7 @@
                     </pic:cNvPicPr>
                   </pic:nvPicPr>
                   <pic:blipFill rotWithShape="1">
-                    <a:blip r:embed="rId31" cstate="print">
+                    <a:blip r:embed="rId32" cstate="print">
                       <a:extLst>
                         <a:ext uri="{28A0092B-C50C-407E-A947-70E740481C1C}">
                           <a14:useLocalDpi xmlns:a14="http://schemas.microsoft.com/office/drawing/2010/main" val="0"/>
@@ -28289,7 +27942,7 @@
                     </pic:cNvPicPr>
                   </pic:nvPicPr>
                   <pic:blipFill rotWithShape="1">
-                    <a:blip r:embed="rId32" cstate="print">
+                    <a:blip r:embed="rId33" cstate="print">
                       <a:extLst>
                         <a:ext uri="{28A0092B-C50C-407E-A947-70E740481C1C}">
                           <a14:useLocalDpi xmlns:a14="http://schemas.microsoft.com/office/drawing/2010/main" val="0"/>
@@ -28438,7 +28091,7 @@
                     </pic:cNvPicPr>
                   </pic:nvPicPr>
                   <pic:blipFill rotWithShape="1">
-                    <a:blip r:embed="rId33" cstate="print">
+                    <a:blip r:embed="rId34" cstate="print">
                       <a:extLst>
                         <a:ext uri="{28A0092B-C50C-407E-A947-70E740481C1C}">
                           <a14:useLocalDpi xmlns:a14="http://schemas.microsoft.com/office/drawing/2010/main" val="0"/>
@@ -28562,22 +28215,21 @@
       <w:r>
         <w:t>és una validació molt sòlida.</w:t>
       </w:r>
-    </w:p>
-    <w:p>
-      <w:pPr>
-        <w:rPr>
-          <w:lang w:eastAsia="en-US"/>
-        </w:rPr>
-      </w:pPr>
-    </w:p>
-    <w:p>
-      <w:pPr>
-        <w:keepNext/>
-        <w:spacing w:before="240"/>
-        <w:rPr>
-          <w:lang w:eastAsia="en-US"/>
-        </w:rPr>
-      </w:pPr>
+      <w:r>
+        <w:rPr>
+          <w:rFonts w:eastAsia="Aptos"/>
+        </w:rPr>
+        <w:br w:type="page"/>
+      </w:r>
+    </w:p>
+    <w:p>
+      <w:pPr>
+        <w:pStyle w:val="Ttulo1"/>
+      </w:pPr>
+      <w:r>
+        <w:lastRenderedPageBreak/>
+        <w:t>Conclusions</w:t>
+      </w:r>
     </w:p>
     <w:p>
       <w:pPr>
@@ -28590,125 +28242,15 @@
           <w:lang w:eastAsia="en-US"/>
         </w:rPr>
       </w:pPr>
-    </w:p>
-    <w:p>
-      <w:pPr>
-        <w:rPr>
+      <w:r>
+        <w:rPr>
+          <w:rFonts w:eastAsia="Aptos"/>
           <w:color w:val="auto"/>
           <w:kern w:val="2"/>
           <w:szCs w:val="22"/>
-        </w:rPr>
-      </w:pPr>
-      <w:r>
-        <w:br w:type="page"/>
-      </w:r>
-    </w:p>
-    <w:p>
-      <w:pPr>
-        <w:spacing w:after="0" w:line="240" w:lineRule="auto"/>
-        <w:rPr>
-          <w:rFonts w:ascii="Aptos Display" w:eastAsia="Aptos" w:hAnsi="Aptos Display"/>
-          <w:b/>
-          <w:bCs/>
-          <w:sz w:val="26"/>
-          <w:szCs w:val="26"/>
-          <w:lang w:eastAsia="en-US"/>
-        </w:rPr>
-      </w:pPr>
-      <w:r>
-        <w:rPr>
-          <w:rFonts w:eastAsia="Aptos"/>
-        </w:rPr>
-        <w:lastRenderedPageBreak/>
-        <w:br w:type="page"/>
-      </w:r>
-    </w:p>
-    <w:p>
-      <w:pPr>
-        <w:spacing w:after="0" w:line="240" w:lineRule="auto"/>
-        <w:rPr>
-          <w:rFonts w:eastAsia="Aptos"/>
-        </w:rPr>
-      </w:pPr>
-      <w:r>
-        <w:rPr>
-          <w:rFonts w:eastAsia="Aptos"/>
-        </w:rPr>
-        <w:lastRenderedPageBreak/>
-        <w:br w:type="page"/>
-      </w:r>
-    </w:p>
-    <w:p>
-      <w:pPr>
-        <w:spacing w:after="0" w:line="240" w:lineRule="auto"/>
-        <w:rPr>
-          <w:rFonts w:eastAsia="Aptos"/>
-        </w:rPr>
-      </w:pPr>
-      <w:r>
-        <w:rPr>
-          <w:rFonts w:eastAsia="Aptos"/>
-        </w:rPr>
-        <w:lastRenderedPageBreak/>
-        <w:br w:type="page"/>
-      </w:r>
-    </w:p>
-    <w:p>
-      <w:pPr>
-        <w:rPr>
-          <w:rFonts w:eastAsia="Aptos"/>
-        </w:rPr>
-      </w:pPr>
-      <w:r>
-        <w:rPr>
-          <w:rFonts w:eastAsia="Aptos"/>
-        </w:rPr>
-        <w:lastRenderedPageBreak/>
-        <w:t>El segon bloc és predictiu: un cop identificades les variables rellevants, l'objectiu és construir models que classifiquin nous estudiants com a regulars o irregulars amb la màxima fiabilitat possible.</w:t>
-      </w:r>
-    </w:p>
-    <w:p>
-      <w:pPr>
-        <w:rPr>
-          <w:rFonts w:eastAsia="Aptos"/>
-        </w:rPr>
-      </w:pPr>
-      <w:r>
-        <w:rPr>
-          <w:rFonts w:eastAsia="Aptos"/>
-        </w:rPr>
-        <w:t>En tots els models s</w:t>
-      </w:r>
-      <w:r>
-        <w:rPr>
-          <w:rFonts w:eastAsia="Aptos"/>
-        </w:rPr>
-        <w:t xml:space="preserve">'ha fet una partició estratificada amb createDataPartition del paquet caret, que preserva la proporció de classes en </w:t>
-      </w:r>
-      <w:r>
-        <w:rPr>
-          <w:rFonts w:eastAsia="Aptos"/>
-        </w:rPr>
-        <w:t xml:space="preserve">els diferents conjunts. S’ha fet així </w:t>
-      </w:r>
-      <w:r>
-        <w:rPr>
-          <w:rFonts w:eastAsia="Aptos"/>
-        </w:rPr>
-        <w:t>per assegurar que el model s'entrena i s'avalua amb distribucions comparables i no hi ha biaixos per atzar.</w:t>
-      </w:r>
-    </w:p>
-    <w:p>
-      <w:pPr>
-        <w:rPr>
-          <w:rFonts w:eastAsia="Aptos"/>
-        </w:rPr>
-      </w:pPr>
-      <w:r>
-        <w:rPr>
-          <w:rFonts w:eastAsia="Aptos"/>
-        </w:rPr>
-        <w:br w:type="page"/>
+          <w:lang w:eastAsia="en-US"/>
+        </w:rPr>
+        <w:t>Les conclusions han de tenir una estreta relació amb el que s’ha argumentat en el desenvolupament del treball, però no poden ser un resum del que s’ha exposat, sinó que han de donar resposta a les hipòtesis, qüestions i objectius plantejats. Han de ser breus, concloents i tenir forma d’asseveració (i no pas d’interrogació); no s’hi han de posar citacions ni és el lloc per introduir-hi idees noves. Les conclusions s’han d’acabar amb un salt de pàgina.</w:t>
       </w:r>
     </w:p>
     <w:p>
@@ -28730,10 +28272,12 @@
           <w:szCs w:val="22"/>
           <w:lang w:eastAsia="en-US"/>
         </w:rPr>
-        <w:lastRenderedPageBreak/>
-        <w:sym w:font="Symbol" w:char="F0B7"/>
-      </w:r>
-      <w:r>
+        <w:br/>
+      </w:r>
+    </w:p>
+    <w:p>
+      <w:pPr>
+        <w:spacing w:line="300" w:lineRule="auto"/>
         <w:rPr>
           <w:rFonts w:eastAsia="Aptos"/>
           <w:color w:val="auto"/>
@@ -28741,172 +28285,7 @@
           <w:szCs w:val="22"/>
           <w:lang w:eastAsia="en-US"/>
         </w:rPr>
-        <w:t xml:space="preserve"> Conclusions:</w:t>
-      </w:r>
-    </w:p>
-    <w:p>
-      <w:pPr>
-        <w:spacing w:line="300" w:lineRule="auto"/>
-        <w:rPr>
-          <w:rFonts w:eastAsia="Aptos"/>
-          <w:color w:val="auto"/>
-          <w:kern w:val="2"/>
-          <w:szCs w:val="22"/>
-          <w:lang w:eastAsia="en-US"/>
-        </w:rPr>
-      </w:pPr>
-      <w:r>
-        <w:rPr>
-          <w:rFonts w:eastAsia="Aptos"/>
-          <w:color w:val="auto"/>
-          <w:kern w:val="2"/>
-          <w:szCs w:val="22"/>
-          <w:lang w:eastAsia="en-US"/>
-        </w:rPr>
-        <w:t>Les conclusions han de tenir una estreta relació amb el que s’ha argumentat en el desenvolupament del treball, però no poden ser un resum del que s’ha exposat, sinó que han de donar resposta a les hipòtesis, qüestions i objectius plantejats. Han de ser breus, concloents i tenir forma d’asseveració (i no pas d’interrogació); no s’hi han de posar citacions ni és el lloc per introduir-hi idees noves. Les conclusions s’han d’acabar amb un salt de pàgina.</w:t>
-      </w:r>
-    </w:p>
-    <w:p>
-      <w:pPr>
-        <w:spacing w:line="300" w:lineRule="auto"/>
-        <w:rPr>
-          <w:rFonts w:eastAsia="Aptos"/>
-          <w:color w:val="auto"/>
-          <w:kern w:val="2"/>
-          <w:szCs w:val="22"/>
-          <w:lang w:eastAsia="en-US"/>
-        </w:rPr>
-      </w:pPr>
-      <w:r>
-        <w:rPr>
-          <w:rFonts w:eastAsia="Aptos"/>
-          <w:color w:val="auto"/>
-          <w:kern w:val="2"/>
-          <w:szCs w:val="22"/>
-          <w:lang w:eastAsia="en-US"/>
-        </w:rPr>
-        <w:sym w:font="Symbol" w:char="F0B7"/>
-      </w:r>
-      <w:r>
-        <w:rPr>
-          <w:rFonts w:eastAsia="Aptos"/>
-          <w:color w:val="auto"/>
-          <w:kern w:val="2"/>
-          <w:szCs w:val="22"/>
-          <w:lang w:eastAsia="en-US"/>
-        </w:rPr>
-        <w:t xml:space="preserve"> Bibliografia:</w:t>
-      </w:r>
-      <w:r>
-        <w:rPr>
-          <w:rFonts w:eastAsia="Aptos"/>
-          <w:color w:val="auto"/>
-          <w:kern w:val="2"/>
-          <w:szCs w:val="22"/>
-          <w:lang w:eastAsia="en-US"/>
-        </w:rPr>
-        <w:br/>
-      </w:r>
-    </w:p>
-    <w:p>
-      <w:pPr>
-        <w:spacing w:line="300" w:lineRule="auto"/>
-        <w:rPr>
-          <w:rFonts w:eastAsia="Aptos"/>
-          <w:color w:val="auto"/>
-          <w:kern w:val="2"/>
-          <w:szCs w:val="22"/>
-          <w:lang w:eastAsia="en-US"/>
-        </w:rPr>
-      </w:pPr>
-      <w:r>
-        <w:rPr>
-          <w:rFonts w:eastAsia="Aptos"/>
-          <w:color w:val="auto"/>
-          <w:kern w:val="2"/>
-          <w:szCs w:val="22"/>
-          <w:lang w:eastAsia="en-US"/>
-        </w:rPr>
-        <w:t>S’hi han de fer constar totes les obres emprades per a l’elaboració del treball, citades o no dins del text i en qualsevol format (paper i/o electrònic). Les referències bibliogràfiques han de ser completes i contenir tota la informació bibliogràfica. S’han d’ordenar alfabèticament pel cognom de l’autor o autora; en cas que hi hagi diverses obres amb una mateixa autoria, l’ordre ha de ser cronològic. Com que hi ha diversos sistemes de referència bibliogràfica, se’n pot triar qualsevol d’aquests; però cal mantenir la coherència en tot el treball. Més informació de com elaborar una bibliografia: http://crai.ub.edu/ca/que-ofereix-el-crai/citacions-bibliografiques http://publica.upc.edu/ca/estil/bibliografies Eines per gestionar i confeccionar citacions i bibliografies: http://crai.ub.edu/ca/que-ofereix-el-crai/citacions-bibliografiques/mendeley http://publica.upc.edu/ca/estil/bibliografies#3</w:t>
-      </w:r>
-    </w:p>
-    <w:p>
-      <w:pPr>
-        <w:spacing w:line="300" w:lineRule="auto"/>
-        <w:rPr>
-          <w:rFonts w:eastAsia="Aptos"/>
-          <w:color w:val="auto"/>
-          <w:kern w:val="2"/>
-          <w:szCs w:val="22"/>
-          <w:lang w:eastAsia="en-US"/>
-        </w:rPr>
-      </w:pPr>
-      <w:r>
-        <w:rPr>
-          <w:rFonts w:eastAsia="Aptos"/>
-          <w:color w:val="auto"/>
-          <w:kern w:val="2"/>
-          <w:szCs w:val="22"/>
-          <w:lang w:eastAsia="en-US"/>
-        </w:rPr>
-        <w:sym w:font="Symbol" w:char="F0B7"/>
-      </w:r>
-      <w:r>
-        <w:rPr>
-          <w:rFonts w:eastAsia="Aptos"/>
-          <w:color w:val="auto"/>
-          <w:kern w:val="2"/>
-          <w:szCs w:val="22"/>
-          <w:lang w:eastAsia="en-US"/>
-        </w:rPr>
-        <w:t xml:space="preserve"> Annexos</w:t>
-      </w:r>
-    </w:p>
-    <w:p>
-      <w:pPr>
-        <w:spacing w:line="300" w:lineRule="auto"/>
-        <w:rPr>
-          <w:rFonts w:eastAsia="Aptos"/>
-          <w:color w:val="auto"/>
-          <w:kern w:val="2"/>
-          <w:szCs w:val="22"/>
-          <w:lang w:eastAsia="en-US"/>
-        </w:rPr>
-      </w:pPr>
-    </w:p>
-    <w:p>
-      <w:pPr>
-        <w:spacing w:line="300" w:lineRule="auto"/>
-        <w:rPr>
-          <w:rFonts w:eastAsia="Aptos"/>
-          <w:color w:val="auto"/>
-          <w:kern w:val="2"/>
-          <w:szCs w:val="22"/>
-          <w:lang w:eastAsia="en-US"/>
-        </w:rPr>
-      </w:pPr>
-    </w:p>
-    <w:p>
-      <w:pPr>
-        <w:spacing w:line="300" w:lineRule="auto"/>
-        <w:rPr>
-          <w:rFonts w:eastAsia="Aptos"/>
-          <w:color w:val="auto"/>
-          <w:kern w:val="2"/>
-          <w:szCs w:val="22"/>
-          <w:lang w:eastAsia="en-US"/>
-        </w:rPr>
-      </w:pPr>
-      <w:r>
-        <w:rPr>
-          <w:rFonts w:eastAsia="Aptos"/>
-          <w:color w:val="auto"/>
-          <w:kern w:val="2"/>
-          <w:szCs w:val="22"/>
-          <w:lang w:eastAsia="en-US"/>
-        </w:rPr>
-        <w:t>Taules: mateixa lletra que la resta del document, o 1-2 punts per sota si les seves dimensions ho requereixen. Han d’anar centrades i dur un títol també centrat a la part superior. Es numeraran d’acord amb el capítol en què s’incloguin. Per exemple, la primera taula del capítol 2 serà la 2.1., la segona la 2.2., etc. Es pot triar lliurement el seu estil, sempre procurant que el seu aspecte sigui adequat a un document de caràcter científic. Gràfics: mateixes indicacions que per a les taules.</w:t>
-      </w:r>
+      </w:pPr>
     </w:p>
     <w:p>
       <w:pPr>
@@ -28992,6 +28371,41 @@
         </w:rPr>
       </w:sdtEndPr>
       <w:sdtContent>
+        <w:p>
+          <w:pPr>
+            <w:pStyle w:val="Ttulo1"/>
+            <w:numPr>
+              <w:ilvl w:val="0"/>
+              <w:numId w:val="0"/>
+            </w:numPr>
+            <w:rPr>
+              <w:rFonts w:eastAsia="Times New Roman"/>
+              <w:b w:val="0"/>
+              <w:bCs w:val="0"/>
+              <w:kern w:val="28"/>
+              <w:sz w:val="22"/>
+              <w:szCs w:val="20"/>
+              <w:lang w:val="es-ES" w:eastAsia="es-ES"/>
+            </w:rPr>
+          </w:pPr>
+        </w:p>
+        <w:p>
+          <w:pPr>
+            <w:spacing w:after="0" w:line="240" w:lineRule="auto"/>
+            <w:jc w:val="left"/>
+            <w:rPr>
+              <w:lang w:val="es-ES"/>
+            </w:rPr>
+          </w:pPr>
+          <w:r>
+            <w:rPr>
+              <w:b/>
+              <w:bCs/>
+              <w:lang w:val="es-ES"/>
+            </w:rPr>
+            <w:br w:type="page"/>
+          </w:r>
+        </w:p>
         <w:p>
           <w:pPr>
             <w:pStyle w:val="Ttulo1"/>
@@ -29004,6 +28418,7 @@
             <w:rPr>
               <w:lang w:val="es-ES"/>
             </w:rPr>
+            <w:lastRenderedPageBreak/>
             <w:t>Bibliografia</w:t>
           </w:r>
           <w:bookmarkEnd w:id="66"/>
@@ -29171,13 +28586,37 @@
         </w:sdt>
       </w:sdtContent>
     </w:sdt>
-    <w:p>
-      <w:pPr>
-        <w:rPr>
-          <w:rFonts w:eastAsia="Aptos"/>
-        </w:rPr>
-      </w:pPr>
-      <w:r>
+    <w:p/>
+    <w:p>
+      <w:pPr>
+        <w:spacing w:line="300" w:lineRule="auto"/>
+        <w:rPr>
+          <w:rFonts w:eastAsia="Aptos"/>
+          <w:color w:val="auto"/>
+          <w:kern w:val="2"/>
+          <w:szCs w:val="22"/>
+          <w:lang w:eastAsia="en-US"/>
+        </w:rPr>
+      </w:pPr>
+      <w:r>
+        <w:rPr>
+          <w:rFonts w:eastAsia="Aptos"/>
+          <w:color w:val="auto"/>
+          <w:kern w:val="2"/>
+          <w:szCs w:val="22"/>
+          <w:lang w:eastAsia="en-US"/>
+        </w:rPr>
+        <w:t>S’hi han de fer constar totes les obres emprades per a l’elaboració del treball, citades o no dins del text i en qualsevol format (paper i/o electrònic). Les referències bibliogràfiques han de ser completes i contenir tota la informació bibliogràfica. S’han d’ordenar alfabèticament pel cognom de l’autor o autora; en cas que hi hagi diverses obres amb una mateixa autoria, l’ordre ha de ser cronològic. Com que hi ha diversos sistemes de referència bibliogràfica, se’n pot triar qualsevol d’aquests; però cal mantenir la coherència en tot el treball. Més informació de com elaborar una bibliografia: http://crai.ub.edu/ca/que-ofereix-el-crai/citacions-bibliografiques http://publica.upc.edu/ca/estil/bibliografies Eines per gestionar i confeccionar citacions i bibliografies: http://crai.ub.edu/ca/que-ofereix-el-crai/citacions-bibliografiques/mendeley http://publica.upc.edu/ca/estil/bibliografies#3</w:t>
+      </w:r>
+    </w:p>
+    <w:p>
+      <w:pPr>
+        <w:rPr>
+          <w:rFonts w:eastAsia="Aptos"/>
+        </w:rPr>
+      </w:pPr>
+      <w:r>
+        <w:lastRenderedPageBreak/>
         <w:br w:type="page"/>
       </w:r>
     </w:p>
@@ -29191,6 +28630,35 @@
         <w:t>Annexos</w:t>
       </w:r>
       <w:bookmarkEnd w:id="67"/>
+    </w:p>
+    <w:p>
+      <w:pPr>
+        <w:spacing w:line="300" w:lineRule="auto"/>
+        <w:rPr>
+          <w:rFonts w:eastAsia="Aptos"/>
+          <w:color w:val="auto"/>
+          <w:kern w:val="2"/>
+          <w:szCs w:val="22"/>
+          <w:lang w:eastAsia="en-US"/>
+        </w:rPr>
+      </w:pPr>
+      <w:r>
+        <w:rPr>
+          <w:rFonts w:eastAsia="Aptos"/>
+          <w:color w:val="auto"/>
+          <w:kern w:val="2"/>
+          <w:szCs w:val="22"/>
+          <w:lang w:eastAsia="en-US"/>
+        </w:rPr>
+        <w:t>Taules: mateixa lletra que la resta del document, o 1-2 punts per sota si les seves dimensions ho requereixen. Han d’anar centrades i dur un títol també centrat a la part superior. Es numeraran d’acord amb el capítol en què s’incloguin. Per exemple, la primera taula del capítol 2 serà la 2.1., la segona la 2.2., etc. Es pot triar lliurement el seu estil, sempre procurant que el seu aspecte sigui adequat a un document de caràcter científic. Gràfics: mateixes indicacions que per a les taules.</w:t>
+      </w:r>
+    </w:p>
+    <w:p>
+      <w:pPr>
+        <w:rPr>
+          <w:lang w:eastAsia="en-US"/>
+        </w:rPr>
+      </w:pPr>
     </w:p>
     <w:p>
       <w:pPr>
@@ -29340,7 +28808,7 @@
         </w:rPr>
         <w:t xml:space="preserve">L’enquesta original es pot consultar en el següent enllaç: </w:t>
       </w:r>
-      <w:hyperlink r:id="rId34" w:history="1">
+      <w:hyperlink r:id="rId35" w:history="1">
         <w:r>
           <w:rPr>
             <w:rFonts w:eastAsia="Aptos"/>
@@ -29403,7 +28871,7 @@
                     </pic:cNvPicPr>
                   </pic:nvPicPr>
                   <pic:blipFill>
-                    <a:blip r:embed="rId35" cstate="print">
+                    <a:blip r:embed="rId36" cstate="print">
                       <a:extLst>
                         <a:ext uri="{28A0092B-C50C-407E-A947-70E740481C1C}">
                           <a14:useLocalDpi xmlns:a14="http://schemas.microsoft.com/office/drawing/2010/main" val="0"/>
@@ -29575,12 +29043,9 @@
           <w:szCs w:val="22"/>
           <w:lang w:eastAsia="en-US"/>
         </w:rPr>
-        <w:t>(El responsable del tractament de les dades és la Secretaria General de la Universitat de Barcelona. Les dades seran tractades amb la finalitat de gestionar l’enquesta. Atesa la naturalesa anònima de la consulta, no es recullen dades que permetin identificar els participants. Per aquest motiu, de conformitat amb l'article 26 del RGPD, s'informa que no serà possible exercir els drets d’accés, rectificació, supressió o portabilitat, ja que la Universitat no pot identificar a quina persona correspon cada resposta.</w:t>
-      </w:r>
-    </w:p>
-    <w:p>
-      <w:pPr>
-        <w:spacing w:line="300" w:lineRule="auto"/>
+        <w:t xml:space="preserve">(El responsable del tractament de les dades és la Secretaria General de la Universitat de Barcelona. Les dades seran tractades amb la finalitat de gestionar l’enquesta. Atesa la naturalesa anònima de la consulta, no es recullen dades que permetin identificar els participants. Per aquest motiu, de conformitat amb l'article 26 del RGPD, s'informa que no serà possible exercir els drets </w:t>
+      </w:r>
+      <w:r>
         <w:rPr>
           <w:rFonts w:eastAsia="Aptos"/>
           <w:i/>
@@ -29590,7 +29055,9 @@
           <w:szCs w:val="22"/>
           <w:lang w:eastAsia="en-US"/>
         </w:rPr>
-      </w:pPr>
+        <w:lastRenderedPageBreak/>
+        <w:t>d’accés, rectificació, supressió o portabilitat, ja que la Universitat no pot identificar a quina persona correspon cada resposta.</w:t>
+      </w:r>
     </w:p>
     <w:p>
       <w:pPr>
@@ -29639,6 +29106,20 @@
         <w:spacing w:line="300" w:lineRule="auto"/>
         <w:rPr>
           <w:rFonts w:eastAsia="Aptos"/>
+          <w:i/>
+          <w:iCs/>
+          <w:color w:val="auto"/>
+          <w:kern w:val="2"/>
+          <w:szCs w:val="22"/>
+          <w:lang w:eastAsia="en-US"/>
+        </w:rPr>
+      </w:pPr>
+    </w:p>
+    <w:p>
+      <w:pPr>
+        <w:spacing w:line="300" w:lineRule="auto"/>
+        <w:rPr>
+          <w:rFonts w:eastAsia="Aptos"/>
           <w:b/>
           <w:bCs/>
           <w:color w:val="auto"/>
@@ -29657,7 +29138,6 @@
           <w:szCs w:val="22"/>
           <w:lang w:eastAsia="en-US"/>
         </w:rPr>
-        <w:lastRenderedPageBreak/>
         <w:t>Secció 1: Dades acadèmiques</w:t>
       </w:r>
     </w:p>
@@ -30916,6 +30396,7 @@
           <w:szCs w:val="22"/>
           <w:lang w:eastAsia="en-US"/>
         </w:rPr>
+        <w:lastRenderedPageBreak/>
         <w:t>Quina edat tens?</w:t>
       </w:r>
     </w:p>
@@ -31231,7 +30712,6 @@
           <w:szCs w:val="22"/>
           <w:lang w:eastAsia="en-US"/>
         </w:rPr>
-        <w:lastRenderedPageBreak/>
         <w:t>Secció 3: La teva opinió sobre les classes i la teva assistència</w:t>
       </w:r>
     </w:p>
@@ -32295,6 +31775,7 @@
           <w:szCs w:val="22"/>
           <w:lang w:eastAsia="en-US"/>
         </w:rPr>
+        <w:lastRenderedPageBreak/>
         <w:t>Indica en quina mesura estàs d'acord amb les següents afirmacions. (1: Gens d’acord a 6: Totalment d’acord)</w:t>
       </w:r>
     </w:p>
@@ -32559,7 +32040,6 @@
       </w:pPr>
       <w:bookmarkStart w:id="71" w:name="_Ref230191949"/>
       <w:r>
-        <w:lastRenderedPageBreak/>
         <w:t xml:space="preserve">Annex </w:t>
       </w:r>
       <w:fldSimple w:instr=" SEQ Annex \* ARABIC ">
@@ -34214,7 +33694,6 @@
                 <w:szCs w:val="22"/>
                 <w:lang w:eastAsia="en-US"/>
               </w:rPr>
-              <w:lastRenderedPageBreak/>
               <w:t>SECCIÓ 2: SITUACIÓ PERSONAL</w:t>
             </w:r>
           </w:p>
@@ -35793,6 +35272,7 @@
                 <w:szCs w:val="22"/>
                 <w:lang w:eastAsia="en-US"/>
               </w:rPr>
+              <w:lastRenderedPageBreak/>
               <w:t>12 (Estratègies d’assistència)</w:t>
             </w:r>
           </w:p>
@@ -36678,7 +36158,6 @@
                 <w:szCs w:val="22"/>
                 <w:lang w:eastAsia="en-US"/>
               </w:rPr>
-              <w:lastRenderedPageBreak/>
               <w:t>SECCIÓ 4: ÚS DE LA IA</w:t>
             </w:r>
           </w:p>
@@ -37203,7 +36682,7 @@
                     </pic:cNvPicPr>
                   </pic:nvPicPr>
                   <pic:blipFill rotWithShape="1">
-                    <a:blip r:embed="rId39" cstate="print">
+                    <a:blip r:embed="rId40" cstate="print">
                       <a:extLst>
                         <a:ext uri="{28A0092B-C50C-407E-A947-70E740481C1C}">
                           <a14:useLocalDpi xmlns:a14="http://schemas.microsoft.com/office/drawing/2010/main" val="0"/>
@@ -37290,7 +36769,7 @@
                     </pic:cNvPicPr>
                   </pic:nvPicPr>
                   <pic:blipFill rotWithShape="1">
-                    <a:blip r:embed="rId40" cstate="print">
+                    <a:blip r:embed="rId41" cstate="print">
                       <a:extLst>
                         <a:ext uri="{28A0092B-C50C-407E-A947-70E740481C1C}">
                           <a14:useLocalDpi xmlns:a14="http://schemas.microsoft.com/office/drawing/2010/main" val="0"/>
@@ -37377,7 +36856,7 @@
                     </pic:cNvPicPr>
                   </pic:nvPicPr>
                   <pic:blipFill rotWithShape="1">
-                    <a:blip r:embed="rId41" cstate="print">
+                    <a:blip r:embed="rId42" cstate="print">
                       <a:extLst>
                         <a:ext uri="{28A0092B-C50C-407E-A947-70E740481C1C}">
                           <a14:useLocalDpi xmlns:a14="http://schemas.microsoft.com/office/drawing/2010/main" val="0"/>
@@ -37470,7 +36949,7 @@
           <w:lang w:eastAsia="en-US"/>
         </w:rPr>
         <w:drawing>
-          <wp:inline distT="0" distB="0" distL="0" distR="0" wp14:anchorId="693BC190" wp14:editId="3778A3C0">
+          <wp:inline distT="0" distB="0" distL="0" distR="0" wp14:anchorId="693BC190" wp14:editId="75A16DE6">
             <wp:extent cx="5400040" cy="4010025"/>
             <wp:effectExtent l="0" t="0" r="0" b="9525"/>
             <wp:docPr id="1947302634" name="Imagen 10"/>
@@ -37487,7 +36966,7 @@
                     </pic:cNvPicPr>
                   </pic:nvPicPr>
                   <pic:blipFill rotWithShape="1">
-                    <a:blip r:embed="rId42" cstate="print">
+                    <a:blip r:embed="rId43" cstate="print">
                       <a:extLst>
                         <a:ext uri="{28A0092B-C50C-407E-A947-70E740481C1C}">
                           <a14:useLocalDpi xmlns:a14="http://schemas.microsoft.com/office/drawing/2010/main" val="0"/>
@@ -37593,7 +37072,7 @@
                     </pic:cNvPicPr>
                   </pic:nvPicPr>
                   <pic:blipFill rotWithShape="1">
-                    <a:blip r:embed="rId43" cstate="print">
+                    <a:blip r:embed="rId44" cstate="print">
                       <a:extLst>
                         <a:ext uri="{28A0092B-C50C-407E-A947-70E740481C1C}">
                           <a14:useLocalDpi xmlns:a14="http://schemas.microsoft.com/office/drawing/2010/main" val="0"/>
@@ -37788,7 +37267,7 @@
                     </pic:cNvPicPr>
                   </pic:nvPicPr>
                   <pic:blipFill rotWithShape="1">
-                    <a:blip r:embed="rId44" cstate="print">
+                    <a:blip r:embed="rId45" cstate="print">
                       <a:extLst>
                         <a:ext uri="{28A0092B-C50C-407E-A947-70E740481C1C}">
                           <a14:useLocalDpi xmlns:a14="http://schemas.microsoft.com/office/drawing/2010/main" val="0"/>
@@ -37915,7 +37394,7 @@
                     </pic:cNvPicPr>
                   </pic:nvPicPr>
                   <pic:blipFill rotWithShape="1">
-                    <a:blip r:embed="rId45" cstate="print">
+                    <a:blip r:embed="rId46" cstate="print">
                       <a:extLst>
                         <a:ext uri="{28A0092B-C50C-407E-A947-70E740481C1C}">
                           <a14:useLocalDpi xmlns:a14="http://schemas.microsoft.com/office/drawing/2010/main" val="0"/>
@@ -37974,8 +37453,8 @@
         <w:pStyle w:val="Descripcin"/>
         <w:keepNext/>
       </w:pPr>
-      <w:bookmarkStart w:id="78" w:name="_Ref230109679"/>
-      <w:bookmarkStart w:id="79" w:name="_Ref230109674"/>
+      <w:bookmarkStart w:id="78" w:name="_Ref230109674"/>
+      <w:bookmarkStart w:id="79" w:name="_Ref230109679"/>
       <w:r>
         <w:t xml:space="preserve">Annex </w:t>
       </w:r>
@@ -37987,11 +37466,11 @@
           <w:t>10</w:t>
         </w:r>
       </w:fldSimple>
+      <w:bookmarkEnd w:id="79"/>
+      <w:r>
+        <w:t>: Calibration plot</w:t>
+      </w:r>
       <w:bookmarkEnd w:id="78"/>
-      <w:r>
-        <w:t>: Calibration plot</w:t>
-      </w:r>
-      <w:bookmarkEnd w:id="79"/>
     </w:p>
     <w:p>
       <w:pPr>
@@ -38034,7 +37513,7 @@
                     </pic:cNvPicPr>
                   </pic:nvPicPr>
                   <pic:blipFill rotWithShape="1">
-                    <a:blip r:embed="rId46" cstate="print">
+                    <a:blip r:embed="rId47" cstate="print">
                       <a:extLst>
                         <a:ext uri="{28A0092B-C50C-407E-A947-70E740481C1C}">
                           <a14:useLocalDpi xmlns:a14="http://schemas.microsoft.com/office/drawing/2010/main" val="0"/>
@@ -38135,7 +37614,7 @@
                     </pic:cNvPicPr>
                   </pic:nvPicPr>
                   <pic:blipFill rotWithShape="1">
-                    <a:blip r:embed="rId47" cstate="print">
+                    <a:blip r:embed="rId48" cstate="print">
                       <a:extLst>
                         <a:ext uri="{28A0092B-C50C-407E-A947-70E740481C1C}">
                           <a14:useLocalDpi xmlns:a14="http://schemas.microsoft.com/office/drawing/2010/main" val="0"/>
@@ -39245,7 +38724,7 @@
                     </pic:cNvPicPr>
                   </pic:nvPicPr>
                   <pic:blipFill rotWithShape="1">
-                    <a:blip r:embed="rId48" cstate="print">
+                    <a:blip r:embed="rId49" cstate="print">
                       <a:extLst>
                         <a:ext uri="{28A0092B-C50C-407E-A947-70E740481C1C}">
                           <a14:useLocalDpi xmlns:a14="http://schemas.microsoft.com/office/drawing/2010/main" val="0"/>
@@ -39345,7 +38824,7 @@
                     </pic:cNvPicPr>
                   </pic:nvPicPr>
                   <pic:blipFill rotWithShape="1">
-                    <a:blip r:embed="rId49" cstate="print">
+                    <a:blip r:embed="rId50" cstate="print">
                       <a:extLst>
                         <a:ext uri="{28A0092B-C50C-407E-A947-70E740481C1C}">
                           <a14:useLocalDpi xmlns:a14="http://schemas.microsoft.com/office/drawing/2010/main" val="0"/>
@@ -39384,7 +38863,7 @@
     </w:p>
     <w:p>
       <w:pPr>
-        <w:spacing w:before="100" w:beforeAutospacing="1" w:after="100" w:afterAutospacing="1" w:line="240" w:lineRule="auto"/>
+        <w:pStyle w:val="Descripcin"/>
         <w:rPr>
           <w:rFonts w:ascii="Times New Roman" w:hAnsi="Times New Roman"/>
           <w:color w:val="auto"/>
@@ -39394,35 +38873,6 @@
           <w:lang w:eastAsia="ca-ES"/>
         </w:rPr>
       </w:pPr>
-    </w:p>
-    <w:p>
-      <w:pPr>
-        <w:rPr>
-          <w:lang w:eastAsia="en-US"/>
-        </w:rPr>
-      </w:pPr>
-    </w:p>
-    <w:p>
-      <w:pPr>
-        <w:pStyle w:val="Ttulo2"/>
-        <w:rPr>
-          <w:color w:val="3A3A3A"/>
-        </w:rPr>
-      </w:pPr>
-      <w:bookmarkStart w:id="84" w:name="_Toc231408558"/>
-      <w:r>
-        <w:lastRenderedPageBreak/>
-        <w:t>Random forest</w:t>
-      </w:r>
-      <w:bookmarkEnd w:id="84"/>
-    </w:p>
-    <w:p>
-      <w:pPr>
-        <w:pStyle w:val="Descripcin"/>
-        <w:keepNext/>
-        <w:jc w:val="left"/>
-      </w:pPr>
-      <w:bookmarkStart w:id="85" w:name="_Ref231123451"/>
       <w:r>
         <w:t xml:space="preserve">Annex </w:t>
       </w:r>
@@ -39432,6 +38882,62 @@
             <w:noProof/>
           </w:rPr>
           <w:t>15</w:t>
+        </w:r>
+      </w:fldSimple>
+      <w:r>
+        <w:t>: Matriu de confusió del logit</w:t>
+      </w:r>
+    </w:p>
+    <w:p>
+      <w:pPr>
+        <w:spacing w:before="100" w:beforeAutospacing="1" w:after="100" w:afterAutospacing="1" w:line="240" w:lineRule="auto"/>
+        <w:rPr>
+          <w:rFonts w:ascii="Times New Roman" w:hAnsi="Times New Roman"/>
+          <w:color w:val="auto"/>
+          <w:kern w:val="0"/>
+          <w:sz w:val="24"/>
+          <w:szCs w:val="24"/>
+          <w:lang w:eastAsia="ca-ES"/>
+        </w:rPr>
+      </w:pPr>
+    </w:p>
+    <w:p>
+      <w:pPr>
+        <w:rPr>
+          <w:lang w:eastAsia="en-US"/>
+        </w:rPr>
+      </w:pPr>
+    </w:p>
+    <w:p>
+      <w:pPr>
+        <w:pStyle w:val="Ttulo2"/>
+        <w:rPr>
+          <w:color w:val="3A3A3A"/>
+        </w:rPr>
+      </w:pPr>
+      <w:bookmarkStart w:id="84" w:name="_Toc231408558"/>
+      <w:r>
+        <w:lastRenderedPageBreak/>
+        <w:t>Random forest</w:t>
+      </w:r>
+      <w:bookmarkEnd w:id="84"/>
+    </w:p>
+    <w:p>
+      <w:pPr>
+        <w:pStyle w:val="Descripcin"/>
+        <w:keepNext/>
+        <w:jc w:val="left"/>
+      </w:pPr>
+      <w:bookmarkStart w:id="85" w:name="_Ref231123451"/>
+      <w:r>
+        <w:t xml:space="preserve">Annex </w:t>
+      </w:r>
+      <w:fldSimple w:instr=" SEQ Annex \* ARABIC ">
+        <w:r>
+          <w:rPr>
+            <w:noProof/>
+          </w:rPr>
+          <w:t>16</w:t>
         </w:r>
       </w:fldSimple>
       <w:bookmarkEnd w:id="85"/>
@@ -39480,7 +38986,7 @@
                     </pic:cNvPicPr>
                   </pic:nvPicPr>
                   <pic:blipFill rotWithShape="1">
-                    <a:blip r:embed="rId50" cstate="print">
+                    <a:blip r:embed="rId51" cstate="print">
                       <a:extLst>
                         <a:ext uri="{28A0092B-C50C-407E-A947-70E740481C1C}">
                           <a14:useLocalDpi xmlns:a14="http://schemas.microsoft.com/office/drawing/2010/main" val="0"/>
@@ -39532,7 +39038,7 @@
           <w:rPr>
             <w:noProof/>
           </w:rPr>
-          <w:t>16</w:t>
+          <w:t>17</w:t>
         </w:r>
       </w:fldSimple>
       <w:bookmarkEnd w:id="86"/>
@@ -39575,7 +39081,7 @@
                     </pic:cNvPicPr>
                   </pic:nvPicPr>
                   <pic:blipFill rotWithShape="1">
-                    <a:blip r:embed="rId51" cstate="print">
+                    <a:blip r:embed="rId52" cstate="print">
                       <a:extLst>
                         <a:ext uri="{28A0092B-C50C-407E-A947-70E740481C1C}">
                           <a14:useLocalDpi xmlns:a14="http://schemas.microsoft.com/office/drawing/2010/main" val="0"/>
@@ -39626,7 +39132,7 @@
           <w:rPr>
             <w:noProof/>
           </w:rPr>
-          <w:t>17</w:t>
+          <w:t>18</w:t>
         </w:r>
       </w:fldSimple>
       <w:r>
@@ -39663,7 +39169,7 @@
                     </pic:cNvPicPr>
                   </pic:nvPicPr>
                   <pic:blipFill rotWithShape="1">
-                    <a:blip r:embed="rId52" cstate="print">
+                    <a:blip r:embed="rId53" cstate="print">
                       <a:extLst>
                         <a:ext uri="{28A0092B-C50C-407E-A947-70E740481C1C}">
                           <a14:useLocalDpi xmlns:a14="http://schemas.microsoft.com/office/drawing/2010/main" val="0"/>
@@ -39714,7 +39220,7 @@
           <w:rPr>
             <w:noProof/>
           </w:rPr>
-          <w:t>18</w:t>
+          <w:t>19</w:t>
         </w:r>
       </w:fldSimple>
       <w:r>
@@ -39751,7 +39257,7 @@
                     </pic:cNvPicPr>
                   </pic:nvPicPr>
                   <pic:blipFill rotWithShape="1">
-                    <a:blip r:embed="rId53" cstate="print">
+                    <a:blip r:embed="rId54" cstate="print">
                       <a:extLst>
                         <a:ext uri="{28A0092B-C50C-407E-A947-70E740481C1C}">
                           <a14:useLocalDpi xmlns:a14="http://schemas.microsoft.com/office/drawing/2010/main" val="0"/>
@@ -39800,7 +39306,7 @@
           <w:rPr>
             <w:noProof/>
           </w:rPr>
-          <w:t>19</w:t>
+          <w:t>20</w:t>
         </w:r>
       </w:fldSimple>
       <w:r>
@@ -39834,7 +39340,7 @@
                     </pic:cNvPicPr>
                   </pic:nvPicPr>
                   <pic:blipFill rotWithShape="1">
-                    <a:blip r:embed="rId54" cstate="print">
+                    <a:blip r:embed="rId55" cstate="print">
                       <a:extLst>
                         <a:ext uri="{28A0092B-C50C-407E-A947-70E740481C1C}">
                           <a14:useLocalDpi xmlns:a14="http://schemas.microsoft.com/office/drawing/2010/main" val="0"/>
@@ -39888,7 +39394,7 @@
           <w:rPr>
             <w:noProof/>
           </w:rPr>
-          <w:t>20</w:t>
+          <w:t>21</w:t>
         </w:r>
       </w:fldSimple>
       <w:r>
@@ -39924,7 +39430,7 @@
                     </pic:cNvPicPr>
                   </pic:nvPicPr>
                   <pic:blipFill rotWithShape="1">
-                    <a:blip r:embed="rId55" cstate="print">
+                    <a:blip r:embed="rId56" cstate="print">
                       <a:extLst>
                         <a:ext uri="{28A0092B-C50C-407E-A947-70E740481C1C}">
                           <a14:useLocalDpi xmlns:a14="http://schemas.microsoft.com/office/drawing/2010/main" val="0"/>
@@ -39981,7 +39487,7 @@
     </w:p>
     <w:p/>
     <w:sectPr>
-      <w:footerReference w:type="default" r:id="rId56"/>
+      <w:footerReference w:type="default" r:id="rId57"/>
       <w:pgSz w:w="11906" w:h="16838"/>
       <w:pgMar w:top="1417" w:right="1701" w:bottom="1417" w:left="1701" w:header="708" w:footer="708" w:gutter="0"/>
       <w:cols w:space="708"/>
@@ -44355,7 +43861,6 @@
   <w:style w:type="character" w:default="1" w:styleId="Fuentedeprrafopredeter">
     <w:name w:val="Default Paragraph Font"/>
     <w:uiPriority w:val="1"/>
-    <w:semiHidden/>
     <w:unhideWhenUsed/>
   </w:style>
   <w:style w:type="table" w:default="1" w:styleId="Tablanormal">

</xml_diff>